<commit_message>
ConnectionTest: tài liệu bổ sung điều kiện hiển thị nút Duyệt KQ và cách kiểm tra khi không thấy nút
- Hiển thị khi LIS.LIS_SAMPLE.MUST_APPROVE_RESULT_BEFORE_RETURN = 1 hoặc LIS.LIS_SAMPLE.IS_SHOW_BUTTON_APPROVE_SAMPLE = 1 (cùng điều kiện cột Duyệt KQ trên lưới mẫu); đổi config phải mở lại màn hình
- A_NghiepVu mục 4.1, B_KyThuat mục 6.1, docs module mục 2 + changelog

Co-Authored-By: Claude Opus 5.5 <noreply@anthropic.com>
</commit_message>
<xml_diff>
--- a/docs/A_NghiepVu_ConnectionTest_DuyetKetQua.docx
+++ b/docs/A_NghiepVu_ConnectionTest_DuyetKetQua.docx
@@ -2036,6 +2036,1004 @@
     </w:p>
     <w:p>
       <w:pPr>
+        <w:pStyle w:val="Heading3"/>
+        <w:spacing w:before="180" w:after="100"/>
+      </w:pPr>
+      <w:r>
+        <w:rPr>
+          <w:rFonts w:ascii="Arial" w:cs="Arial" w:eastAsia="Arial" w:hAnsi="Arial"/>
+        </w:rPr>
+        <w:t xml:space="preserve">Điều kiện hiển thị nút</w:t>
+      </w:r>
+    </w:p>
+    <w:p>
+      <w:pPr>
+        <w:spacing w:after="120"/>
+      </w:pPr>
+      <w:r>
+        <w:rPr>
+          <w:rFonts w:ascii="Arial" w:cs="Arial" w:eastAsia="Arial" w:hAnsi="Arial"/>
+        </w:rPr>
+        <w:t xml:space="preserve">Nút "Duyệt KQ / Hủy duyệt KQ" và 2 cột "Người duyệt KQ", "TG duyệt" </w:t>
+      </w:r>
+      <w:r>
+        <w:rPr>
+          <w:rFonts w:ascii="Arial" w:cs="Arial" w:eastAsia="Arial" w:hAnsi="Arial"/>
+          <w:b/>
+          <w:bCs/>
+        </w:rPr>
+        <w:t xml:space="preserve">chỉ hiển thị</w:t>
+      </w:r>
+      <w:r>
+        <w:rPr>
+          <w:rFonts w:ascii="Arial" w:cs="Arial" w:eastAsia="Arial" w:hAnsi="Arial"/>
+        </w:rPr>
+        <w:t xml:space="preserve"> khi </w:t>
+      </w:r>
+      <w:r>
+        <w:rPr>
+          <w:rFonts w:ascii="Arial" w:cs="Arial" w:eastAsia="Arial" w:hAnsi="Arial"/>
+          <w:b/>
+          <w:bCs/>
+        </w:rPr>
+        <w:t xml:space="preserve">một trong hai</w:t>
+      </w:r>
+      <w:r>
+        <w:rPr>
+          <w:rFonts w:ascii="Arial" w:cs="Arial" w:eastAsia="Arial" w:hAnsi="Arial"/>
+        </w:rPr>
+        <w:t xml:space="preserve"> cấu hình sau có giá trị </w:t>
+      </w:r>
+      <w:r>
+        <w:rPr>
+          <w:rFonts w:ascii="Arial" w:cs="Arial" w:eastAsia="Arial" w:hAnsi="Arial"/>
+          <w:b/>
+          <w:bCs/>
+        </w:rPr>
+        <w:t xml:space="preserve">1</w:t>
+      </w:r>
+      <w:r>
+        <w:rPr>
+          <w:rFonts w:ascii="Arial" w:cs="Arial" w:eastAsia="Arial" w:hAnsi="Arial"/>
+        </w:rPr>
+        <w:t xml:space="preserve">:</w:t>
+      </w:r>
+    </w:p>
+    <w:tbl>
+      <w:tblPr>
+        <w:tblW w:type="dxa" w:w="9638"/>
+        <w:tblBorders>
+          <w:top w:val="single" w:color="auto" w:sz="4"/>
+          <w:left w:val="single" w:color="auto" w:sz="4"/>
+          <w:bottom w:val="single" w:color="auto" w:sz="4"/>
+          <w:right w:val="single" w:color="auto" w:sz="4"/>
+          <w:insideH w:val="single" w:color="auto" w:sz="4"/>
+          <w:insideV w:val="single" w:color="auto" w:sz="4"/>
+        </w:tblBorders>
+      </w:tblPr>
+      <w:tblGrid>
+        <w:gridCol w:w="4626"/>
+        <w:gridCol w:w="1157"/>
+        <w:gridCol w:w="3855"/>
+      </w:tblGrid>
+      <w:tr>
+        <w:trPr>
+          <w:tblHeader/>
+        </w:trPr>
+        <w:tc>
+          <w:tcPr>
+            <w:tcW w:type="dxa" w:w="4626"/>
+            <w:tcBorders>
+              <w:top w:val="single" w:color="BFBFBF" w:sz="4"/>
+              <w:left w:val="single" w:color="BFBFBF" w:sz="4"/>
+              <w:bottom w:val="single" w:color="BFBFBF" w:sz="4"/>
+              <w:right w:val="single" w:color="BFBFBF" w:sz="4"/>
+            </w:tcBorders>
+            <w:shd w:fill="DCE6F1" w:color="auto" w:val="clear"/>
+            <w:tcMar>
+              <w:top w:type="dxa" w:w="60"/>
+              <w:left w:type="dxa" w:w="100"/>
+              <w:bottom w:type="dxa" w:w="60"/>
+              <w:right w:type="dxa" w:w="100"/>
+            </w:tcMar>
+          </w:tcPr>
+          <w:p>
+            <w:pPr>
+              <w:spacing w:after="20"/>
+            </w:pPr>
+            <w:r>
+              <w:rPr>
+                <w:rFonts w:ascii="Arial" w:cs="Arial" w:eastAsia="Arial" w:hAnsi="Arial"/>
+                <w:b/>
+                <w:bCs/>
+                <w:sz w:val="20"/>
+                <w:szCs w:val="20"/>
+              </w:rPr>
+              <w:t xml:space="preserve">Cấu hình</w:t>
+            </w:r>
+          </w:p>
+        </w:tc>
+        <w:tc>
+          <w:tcPr>
+            <w:tcW w:type="dxa" w:w="1157"/>
+            <w:tcBorders>
+              <w:top w:val="single" w:color="BFBFBF" w:sz="4"/>
+              <w:left w:val="single" w:color="BFBFBF" w:sz="4"/>
+              <w:bottom w:val="single" w:color="BFBFBF" w:sz="4"/>
+              <w:right w:val="single" w:color="BFBFBF" w:sz="4"/>
+            </w:tcBorders>
+            <w:shd w:fill="DCE6F1" w:color="auto" w:val="clear"/>
+            <w:tcMar>
+              <w:top w:type="dxa" w:w="60"/>
+              <w:left w:type="dxa" w:w="100"/>
+              <w:bottom w:type="dxa" w:w="60"/>
+              <w:right w:type="dxa" w:w="100"/>
+            </w:tcMar>
+          </w:tcPr>
+          <w:p>
+            <w:pPr>
+              <w:spacing w:after="20"/>
+            </w:pPr>
+            <w:r>
+              <w:rPr>
+                <w:rFonts w:ascii="Arial" w:cs="Arial" w:eastAsia="Arial" w:hAnsi="Arial"/>
+                <w:b/>
+                <w:bCs/>
+                <w:sz w:val="20"/>
+                <w:szCs w:val="20"/>
+              </w:rPr>
+              <w:t xml:space="preserve">Giá trị</w:t>
+            </w:r>
+          </w:p>
+        </w:tc>
+        <w:tc>
+          <w:tcPr>
+            <w:tcW w:type="dxa" w:w="3855"/>
+            <w:tcBorders>
+              <w:top w:val="single" w:color="BFBFBF" w:sz="4"/>
+              <w:left w:val="single" w:color="BFBFBF" w:sz="4"/>
+              <w:bottom w:val="single" w:color="BFBFBF" w:sz="4"/>
+              <w:right w:val="single" w:color="BFBFBF" w:sz="4"/>
+            </w:tcBorders>
+            <w:shd w:fill="DCE6F1" w:color="auto" w:val="clear"/>
+            <w:tcMar>
+              <w:top w:type="dxa" w:w="60"/>
+              <w:left w:type="dxa" w:w="100"/>
+              <w:bottom w:type="dxa" w:w="60"/>
+              <w:right w:type="dxa" w:w="100"/>
+            </w:tcMar>
+          </w:tcPr>
+          <w:p>
+            <w:pPr>
+              <w:spacing w:after="20"/>
+            </w:pPr>
+            <w:r>
+              <w:rPr>
+                <w:rFonts w:ascii="Arial" w:cs="Arial" w:eastAsia="Arial" w:hAnsi="Arial"/>
+                <w:b/>
+                <w:bCs/>
+                <w:sz w:val="20"/>
+                <w:szCs w:val="20"/>
+              </w:rPr>
+              <w:t xml:space="preserve">Ý nghĩa</w:t>
+            </w:r>
+          </w:p>
+        </w:tc>
+      </w:tr>
+      <w:tr>
+        <w:tc>
+          <w:tcPr>
+            <w:tcW w:type="dxa" w:w="4626"/>
+            <w:tcBorders>
+              <w:top w:val="single" w:color="BFBFBF" w:sz="4"/>
+              <w:left w:val="single" w:color="BFBFBF" w:sz="4"/>
+              <w:bottom w:val="single" w:color="BFBFBF" w:sz="4"/>
+              <w:right w:val="single" w:color="BFBFBF" w:sz="4"/>
+            </w:tcBorders>
+            <w:tcMar>
+              <w:top w:type="dxa" w:w="60"/>
+              <w:left w:type="dxa" w:w="100"/>
+              <w:bottom w:type="dxa" w:w="60"/>
+              <w:right w:type="dxa" w:w="100"/>
+            </w:tcMar>
+          </w:tcPr>
+          <w:p>
+            <w:pPr>
+              <w:spacing w:after="20"/>
+            </w:pPr>
+            <w:r>
+              <w:rPr>
+                <w:rFonts w:ascii="Arial" w:cs="Arial" w:eastAsia="Arial" w:hAnsi="Arial"/>
+                <w:sz w:val="20"/>
+                <w:szCs w:val="20"/>
+              </w:rPr>
+              <w:t xml:space="preserve">LIS.LIS_SAMPLE.MUST_APPROVE_RESULT_BEFORE_RETURN</w:t>
+            </w:r>
+          </w:p>
+        </w:tc>
+        <w:tc>
+          <w:tcPr>
+            <w:tcW w:type="dxa" w:w="1157"/>
+            <w:tcBorders>
+              <w:top w:val="single" w:color="BFBFBF" w:sz="4"/>
+              <w:left w:val="single" w:color="BFBFBF" w:sz="4"/>
+              <w:bottom w:val="single" w:color="BFBFBF" w:sz="4"/>
+              <w:right w:val="single" w:color="BFBFBF" w:sz="4"/>
+            </w:tcBorders>
+            <w:tcMar>
+              <w:top w:type="dxa" w:w="60"/>
+              <w:left w:type="dxa" w:w="100"/>
+              <w:bottom w:type="dxa" w:w="60"/>
+              <w:right w:type="dxa" w:w="100"/>
+            </w:tcMar>
+          </w:tcPr>
+          <w:p>
+            <w:pPr>
+              <w:spacing w:after="20"/>
+            </w:pPr>
+            <w:r>
+              <w:rPr>
+                <w:rFonts w:ascii="Arial" w:cs="Arial" w:eastAsia="Arial" w:hAnsi="Arial"/>
+                <w:sz w:val="20"/>
+                <w:szCs w:val="20"/>
+              </w:rPr>
+              <w:t xml:space="preserve">1</w:t>
+            </w:r>
+          </w:p>
+        </w:tc>
+        <w:tc>
+          <w:tcPr>
+            <w:tcW w:type="dxa" w:w="3855"/>
+            <w:tcBorders>
+              <w:top w:val="single" w:color="BFBFBF" w:sz="4"/>
+              <w:left w:val="single" w:color="BFBFBF" w:sz="4"/>
+              <w:bottom w:val="single" w:color="BFBFBF" w:sz="4"/>
+              <w:right w:val="single" w:color="BFBFBF" w:sz="4"/>
+            </w:tcBorders>
+            <w:tcMar>
+              <w:top w:type="dxa" w:w="60"/>
+              <w:left w:type="dxa" w:w="100"/>
+              <w:bottom w:type="dxa" w:w="60"/>
+              <w:right w:type="dxa" w:w="100"/>
+            </w:tcMar>
+          </w:tcPr>
+          <w:p>
+            <w:pPr>
+              <w:spacing w:after="20"/>
+            </w:pPr>
+            <w:r>
+              <w:rPr>
+                <w:rFonts w:ascii="Arial" w:cs="Arial" w:eastAsia="Arial" w:hAnsi="Arial"/>
+                <w:sz w:val="20"/>
+                <w:szCs w:val="20"/>
+              </w:rPr>
+              <w:t xml:space="preserve">Bắt buộc duyệt kết quả rồi mới được trả kết quả</w:t>
+            </w:r>
+          </w:p>
+        </w:tc>
+      </w:tr>
+      <w:tr>
+        <w:tc>
+          <w:tcPr>
+            <w:tcW w:type="dxa" w:w="4626"/>
+            <w:tcBorders>
+              <w:top w:val="single" w:color="BFBFBF" w:sz="4"/>
+              <w:left w:val="single" w:color="BFBFBF" w:sz="4"/>
+              <w:bottom w:val="single" w:color="BFBFBF" w:sz="4"/>
+              <w:right w:val="single" w:color="BFBFBF" w:sz="4"/>
+            </w:tcBorders>
+            <w:tcMar>
+              <w:top w:type="dxa" w:w="60"/>
+              <w:left w:type="dxa" w:w="100"/>
+              <w:bottom w:type="dxa" w:w="60"/>
+              <w:right w:type="dxa" w:w="100"/>
+            </w:tcMar>
+          </w:tcPr>
+          <w:p>
+            <w:pPr>
+              <w:spacing w:after="20"/>
+            </w:pPr>
+            <w:r>
+              <w:rPr>
+                <w:rFonts w:ascii="Arial" w:cs="Arial" w:eastAsia="Arial" w:hAnsi="Arial"/>
+                <w:sz w:val="20"/>
+                <w:szCs w:val="20"/>
+              </w:rPr>
+              <w:t xml:space="preserve">LIS.LIS_SAMPLE.IS_SHOW_BUTTON_APPROVE_SAMPLE</w:t>
+            </w:r>
+          </w:p>
+        </w:tc>
+        <w:tc>
+          <w:tcPr>
+            <w:tcW w:type="dxa" w:w="1157"/>
+            <w:tcBorders>
+              <w:top w:val="single" w:color="BFBFBF" w:sz="4"/>
+              <w:left w:val="single" w:color="BFBFBF" w:sz="4"/>
+              <w:bottom w:val="single" w:color="BFBFBF" w:sz="4"/>
+              <w:right w:val="single" w:color="BFBFBF" w:sz="4"/>
+            </w:tcBorders>
+            <w:tcMar>
+              <w:top w:type="dxa" w:w="60"/>
+              <w:left w:type="dxa" w:w="100"/>
+              <w:bottom w:type="dxa" w:w="60"/>
+              <w:right w:type="dxa" w:w="100"/>
+            </w:tcMar>
+          </w:tcPr>
+          <w:p>
+            <w:pPr>
+              <w:spacing w:after="20"/>
+            </w:pPr>
+            <w:r>
+              <w:rPr>
+                <w:rFonts w:ascii="Arial" w:cs="Arial" w:eastAsia="Arial" w:hAnsi="Arial"/>
+                <w:sz w:val="20"/>
+                <w:szCs w:val="20"/>
+              </w:rPr>
+              <w:t xml:space="preserve">1</w:t>
+            </w:r>
+          </w:p>
+        </w:tc>
+        <w:tc>
+          <w:tcPr>
+            <w:tcW w:type="dxa" w:w="3855"/>
+            <w:tcBorders>
+              <w:top w:val="single" w:color="BFBFBF" w:sz="4"/>
+              <w:left w:val="single" w:color="BFBFBF" w:sz="4"/>
+              <w:bottom w:val="single" w:color="BFBFBF" w:sz="4"/>
+              <w:right w:val="single" w:color="BFBFBF" w:sz="4"/>
+            </w:tcBorders>
+            <w:tcMar>
+              <w:top w:type="dxa" w:w="60"/>
+              <w:left w:type="dxa" w:w="100"/>
+              <w:bottom w:type="dxa" w:w="60"/>
+              <w:right w:type="dxa" w:w="100"/>
+            </w:tcMar>
+          </w:tcPr>
+          <w:p>
+            <w:pPr>
+              <w:spacing w:after="20"/>
+            </w:pPr>
+            <w:r>
+              <w:rPr>
+                <w:rFonts w:ascii="Arial" w:cs="Arial" w:eastAsia="Arial" w:hAnsi="Arial"/>
+                <w:sz w:val="20"/>
+                <w:szCs w:val="20"/>
+              </w:rPr>
+              <w:t xml:space="preserve">Hiện các nút duyệt (kèm cột Duyệt mẫu, Từ chối trên danh sách mẫu)</w:t>
+            </w:r>
+          </w:p>
+        </w:tc>
+      </w:tr>
+    </w:tbl>
+    <w:p>
+      <w:pPr>
+        <w:spacing w:after="120"/>
+      </w:pPr>
+    </w:p>
+    <w:p>
+      <w:pPr>
+        <w:pStyle w:val="ListParagraph"/>
+        <w:numPr>
+          <w:ilvl w:val="0"/>
+          <w:numId w:val="2"/>
+        </w:numPr>
+        <w:spacing w:after="60"/>
+      </w:pPr>
+      <w:r>
+        <w:rPr>
+          <w:rFonts w:ascii="Arial" w:cs="Arial" w:eastAsia="Arial" w:hAnsi="Arial"/>
+        </w:rPr>
+        <w:t xml:space="preserve">Đây cũng là điều kiện hiện cột </w:t>
+      </w:r>
+      <w:r>
+        <w:rPr>
+          <w:rFonts w:ascii="Arial" w:cs="Arial" w:eastAsia="Arial" w:hAnsi="Arial"/>
+          <w:b/>
+          <w:bCs/>
+        </w:rPr>
+        <w:t xml:space="preserve">"Duyệt KQ"</w:t>
+      </w:r>
+      <w:r>
+        <w:rPr>
+          <w:rFonts w:ascii="Arial" w:cs="Arial" w:eastAsia="Arial" w:hAnsi="Arial"/>
+        </w:rPr>
+        <w:t xml:space="preserve"> trên danh sách mẫu: có cột này thì cũng có nút ở khu kết quả.</w:t>
+      </w:r>
+    </w:p>
+    <w:p>
+      <w:pPr>
+        <w:pStyle w:val="ListParagraph"/>
+        <w:numPr>
+          <w:ilvl w:val="0"/>
+          <w:numId w:val="2"/>
+        </w:numPr>
+        <w:spacing w:after="60"/>
+      </w:pPr>
+      <w:r>
+        <w:rPr>
+          <w:rFonts w:ascii="Arial" w:cs="Arial" w:eastAsia="Arial" w:hAnsi="Arial"/>
+        </w:rPr>
+        <w:t xml:space="preserve">Cả 2 cấu hình khác 1 → </w:t>
+      </w:r>
+      <w:r>
+        <w:rPr>
+          <w:rFonts w:ascii="Arial" w:cs="Arial" w:eastAsia="Arial" w:hAnsi="Arial"/>
+          <w:b/>
+          <w:bCs/>
+        </w:rPr>
+        <w:t xml:space="preserve">ẩn</w:t>
+      </w:r>
+      <w:r>
+        <w:rPr>
+          <w:rFonts w:ascii="Arial" w:cs="Arial" w:eastAsia="Arial" w:hAnsi="Arial"/>
+        </w:rPr>
+        <w:t xml:space="preserve"> nút và 2 cột; màn hình giữ như trước.</w:t>
+      </w:r>
+    </w:p>
+    <w:p>
+      <w:pPr>
+        <w:pStyle w:val="ListParagraph"/>
+        <w:numPr>
+          <w:ilvl w:val="0"/>
+          <w:numId w:val="2"/>
+        </w:numPr>
+        <w:spacing w:after="60"/>
+      </w:pPr>
+      <w:r>
+        <w:rPr>
+          <w:rFonts w:ascii="Arial" w:cs="Arial" w:eastAsia="Arial" w:hAnsi="Arial"/>
+        </w:rPr>
+        <w:t xml:space="preserve">Cấu hình được đọc khi </w:t>
+      </w:r>
+      <w:r>
+        <w:rPr>
+          <w:rFonts w:ascii="Arial" w:cs="Arial" w:eastAsia="Arial" w:hAnsi="Arial"/>
+          <w:b/>
+          <w:bCs/>
+        </w:rPr>
+        <w:t xml:space="preserve">mở màn hình</w:t>
+      </w:r>
+      <w:r>
+        <w:rPr>
+          <w:rFonts w:ascii="Arial" w:cs="Arial" w:eastAsia="Arial" w:hAnsi="Arial"/>
+        </w:rPr>
+        <w:t xml:space="preserve">: sau khi đổi cấu hình phải đóng và mở lại màn hình Kết nối xét nghiệm.</w:t>
+      </w:r>
+    </w:p>
+    <w:p>
+      <w:pPr>
+        <w:pStyle w:val="ListParagraph"/>
+        <w:numPr>
+          <w:ilvl w:val="0"/>
+          <w:numId w:val="2"/>
+        </w:numPr>
+        <w:spacing w:after="60"/>
+      </w:pPr>
+      <w:r>
+        <w:rPr>
+          <w:rFonts w:ascii="Arial" w:cs="Arial" w:eastAsia="Arial" w:hAnsi="Arial"/>
+        </w:rPr>
+        <w:t xml:space="preserve">Khi đã hiển thị, nút </w:t>
+      </w:r>
+      <w:r>
+        <w:rPr>
+          <w:rFonts w:ascii="Arial" w:cs="Arial" w:eastAsia="Arial" w:hAnsi="Arial"/>
+          <w:b/>
+          <w:bCs/>
+        </w:rPr>
+        <w:t xml:space="preserve">mờ (không bấm được)</w:t>
+      </w:r>
+      <w:r>
+        <w:rPr>
+          <w:rFonts w:ascii="Arial" w:cs="Arial" w:eastAsia="Arial" w:hAnsi="Arial"/>
+        </w:rPr>
+        <w:t xml:space="preserve"> nếu mẫu đang chọn không ở trạng thái Đã chấp nhận / Có kết quả / Đã duyệt kết quả (xem bảng trên).</w:t>
+      </w:r>
+    </w:p>
+    <w:p>
+      <w:pPr>
+        <w:pStyle w:val="Heading3"/>
+        <w:spacing w:before="180" w:after="100"/>
+      </w:pPr>
+      <w:r>
+        <w:rPr>
+          <w:rFonts w:ascii="Arial" w:cs="Arial" w:eastAsia="Arial" w:hAnsi="Arial"/>
+        </w:rPr>
+        <w:t xml:space="preserve">Không thấy nút Duyệt KQ — cách kiểm tra</w:t>
+      </w:r>
+    </w:p>
+    <w:tbl>
+      <w:tblPr>
+        <w:tblW w:type="dxa" w:w="9638"/>
+        <w:tblBorders>
+          <w:top w:val="single" w:color="auto" w:sz="4"/>
+          <w:left w:val="single" w:color="auto" w:sz="4"/>
+          <w:bottom w:val="single" w:color="auto" w:sz="4"/>
+          <w:right w:val="single" w:color="auto" w:sz="4"/>
+          <w:insideH w:val="single" w:color="auto" w:sz="4"/>
+          <w:insideV w:val="single" w:color="auto" w:sz="4"/>
+        </w:tblBorders>
+      </w:tblPr>
+      <w:tblGrid>
+        <w:gridCol w:w="3277"/>
+        <w:gridCol w:w="3181"/>
+        <w:gridCol w:w="3180"/>
+      </w:tblGrid>
+      <w:tr>
+        <w:trPr>
+          <w:tblHeader/>
+        </w:trPr>
+        <w:tc>
+          <w:tcPr>
+            <w:tcW w:type="dxa" w:w="3277"/>
+            <w:tcBorders>
+              <w:top w:val="single" w:color="BFBFBF" w:sz="4"/>
+              <w:left w:val="single" w:color="BFBFBF" w:sz="4"/>
+              <w:bottom w:val="single" w:color="BFBFBF" w:sz="4"/>
+              <w:right w:val="single" w:color="BFBFBF" w:sz="4"/>
+            </w:tcBorders>
+            <w:shd w:fill="DCE6F1" w:color="auto" w:val="clear"/>
+            <w:tcMar>
+              <w:top w:type="dxa" w:w="60"/>
+              <w:left w:type="dxa" w:w="100"/>
+              <w:bottom w:type="dxa" w:w="60"/>
+              <w:right w:type="dxa" w:w="100"/>
+            </w:tcMar>
+          </w:tcPr>
+          <w:p>
+            <w:pPr>
+              <w:spacing w:after="20"/>
+            </w:pPr>
+            <w:r>
+              <w:rPr>
+                <w:rFonts w:ascii="Arial" w:cs="Arial" w:eastAsia="Arial" w:hAnsi="Arial"/>
+                <w:b/>
+                <w:bCs/>
+                <w:sz w:val="20"/>
+                <w:szCs w:val="20"/>
+              </w:rPr>
+              <w:t xml:space="preserve">Hiện tượng</w:t>
+            </w:r>
+          </w:p>
+        </w:tc>
+        <w:tc>
+          <w:tcPr>
+            <w:tcW w:type="dxa" w:w="3181"/>
+            <w:tcBorders>
+              <w:top w:val="single" w:color="BFBFBF" w:sz="4"/>
+              <w:left w:val="single" w:color="BFBFBF" w:sz="4"/>
+              <w:bottom w:val="single" w:color="BFBFBF" w:sz="4"/>
+              <w:right w:val="single" w:color="BFBFBF" w:sz="4"/>
+            </w:tcBorders>
+            <w:shd w:fill="DCE6F1" w:color="auto" w:val="clear"/>
+            <w:tcMar>
+              <w:top w:type="dxa" w:w="60"/>
+              <w:left w:type="dxa" w:w="100"/>
+              <w:bottom w:type="dxa" w:w="60"/>
+              <w:right w:type="dxa" w:w="100"/>
+            </w:tcMar>
+          </w:tcPr>
+          <w:p>
+            <w:pPr>
+              <w:spacing w:after="20"/>
+            </w:pPr>
+            <w:r>
+              <w:rPr>
+                <w:rFonts w:ascii="Arial" w:cs="Arial" w:eastAsia="Arial" w:hAnsi="Arial"/>
+                <w:b/>
+                <w:bCs/>
+                <w:sz w:val="20"/>
+                <w:szCs w:val="20"/>
+              </w:rPr>
+              <w:t xml:space="preserve">Nguyên nhân</w:t>
+            </w:r>
+          </w:p>
+        </w:tc>
+        <w:tc>
+          <w:tcPr>
+            <w:tcW w:type="dxa" w:w="3180"/>
+            <w:tcBorders>
+              <w:top w:val="single" w:color="BFBFBF" w:sz="4"/>
+              <w:left w:val="single" w:color="BFBFBF" w:sz="4"/>
+              <w:bottom w:val="single" w:color="BFBFBF" w:sz="4"/>
+              <w:right w:val="single" w:color="BFBFBF" w:sz="4"/>
+            </w:tcBorders>
+            <w:shd w:fill="DCE6F1" w:color="auto" w:val="clear"/>
+            <w:tcMar>
+              <w:top w:type="dxa" w:w="60"/>
+              <w:left w:type="dxa" w:w="100"/>
+              <w:bottom w:type="dxa" w:w="60"/>
+              <w:right w:type="dxa" w:w="100"/>
+            </w:tcMar>
+          </w:tcPr>
+          <w:p>
+            <w:pPr>
+              <w:spacing w:after="20"/>
+            </w:pPr>
+            <w:r>
+              <w:rPr>
+                <w:rFonts w:ascii="Arial" w:cs="Arial" w:eastAsia="Arial" w:hAnsi="Arial"/>
+                <w:b/>
+                <w:bCs/>
+                <w:sz w:val="20"/>
+                <w:szCs w:val="20"/>
+              </w:rPr>
+              <w:t xml:space="preserve">Cách xử lý</w:t>
+            </w:r>
+          </w:p>
+        </w:tc>
+      </w:tr>
+      <w:tr>
+        <w:tc>
+          <w:tcPr>
+            <w:tcW w:type="dxa" w:w="3277"/>
+            <w:tcBorders>
+              <w:top w:val="single" w:color="BFBFBF" w:sz="4"/>
+              <w:left w:val="single" w:color="BFBFBF" w:sz="4"/>
+              <w:bottom w:val="single" w:color="BFBFBF" w:sz="4"/>
+              <w:right w:val="single" w:color="BFBFBF" w:sz="4"/>
+            </w:tcBorders>
+            <w:tcMar>
+              <w:top w:type="dxa" w:w="60"/>
+              <w:left w:type="dxa" w:w="100"/>
+              <w:bottom w:type="dxa" w:w="60"/>
+              <w:right w:type="dxa" w:w="100"/>
+            </w:tcMar>
+          </w:tcPr>
+          <w:p>
+            <w:pPr>
+              <w:spacing w:after="20"/>
+            </w:pPr>
+            <w:r>
+              <w:rPr>
+                <w:rFonts w:ascii="Arial" w:cs="Arial" w:eastAsia="Arial" w:hAnsi="Arial"/>
+                <w:sz w:val="20"/>
+                <w:szCs w:val="20"/>
+              </w:rPr>
+              <w:t xml:space="preserve">Danh sách mẫu không có cột "Duyệt KQ", khu kết quả không có nút</w:t>
+            </w:r>
+          </w:p>
+        </w:tc>
+        <w:tc>
+          <w:tcPr>
+            <w:tcW w:type="dxa" w:w="3181"/>
+            <w:tcBorders>
+              <w:top w:val="single" w:color="BFBFBF" w:sz="4"/>
+              <w:left w:val="single" w:color="BFBFBF" w:sz="4"/>
+              <w:bottom w:val="single" w:color="BFBFBF" w:sz="4"/>
+              <w:right w:val="single" w:color="BFBFBF" w:sz="4"/>
+            </w:tcBorders>
+            <w:tcMar>
+              <w:top w:type="dxa" w:w="60"/>
+              <w:left w:type="dxa" w:w="100"/>
+              <w:bottom w:type="dxa" w:w="60"/>
+              <w:right w:type="dxa" w:w="100"/>
+            </w:tcMar>
+          </w:tcPr>
+          <w:p>
+            <w:pPr>
+              <w:spacing w:after="20"/>
+            </w:pPr>
+            <w:r>
+              <w:rPr>
+                <w:rFonts w:ascii="Arial" w:cs="Arial" w:eastAsia="Arial" w:hAnsi="Arial"/>
+                <w:sz w:val="20"/>
+                <w:szCs w:val="20"/>
+              </w:rPr>
+              <w:t xml:space="preserve">Cả 2 cấu hình ở trên đang khác 1</w:t>
+            </w:r>
+          </w:p>
+        </w:tc>
+        <w:tc>
+          <w:tcPr>
+            <w:tcW w:type="dxa" w:w="3180"/>
+            <w:tcBorders>
+              <w:top w:val="single" w:color="BFBFBF" w:sz="4"/>
+              <w:left w:val="single" w:color="BFBFBF" w:sz="4"/>
+              <w:bottom w:val="single" w:color="BFBFBF" w:sz="4"/>
+              <w:right w:val="single" w:color="BFBFBF" w:sz="4"/>
+            </w:tcBorders>
+            <w:tcMar>
+              <w:top w:type="dxa" w:w="60"/>
+              <w:left w:type="dxa" w:w="100"/>
+              <w:bottom w:type="dxa" w:w="60"/>
+              <w:right w:type="dxa" w:w="100"/>
+            </w:tcMar>
+          </w:tcPr>
+          <w:p>
+            <w:pPr>
+              <w:spacing w:after="20"/>
+            </w:pPr>
+            <w:r>
+              <w:rPr>
+                <w:rFonts w:ascii="Arial" w:cs="Arial" w:eastAsia="Arial" w:hAnsi="Arial"/>
+                <w:sz w:val="20"/>
+                <w:szCs w:val="20"/>
+              </w:rPr>
+              <w:t xml:space="preserve">Bật 1 trong 2 cấu hình = 1 (khuyến nghị MUST_APPROVE_RESULT_BEFORE_RETURN), đóng và mở lại màn hình</w:t>
+            </w:r>
+          </w:p>
+        </w:tc>
+      </w:tr>
+      <w:tr>
+        <w:tc>
+          <w:tcPr>
+            <w:tcW w:type="dxa" w:w="3277"/>
+            <w:tcBorders>
+              <w:top w:val="single" w:color="BFBFBF" w:sz="4"/>
+              <w:left w:val="single" w:color="BFBFBF" w:sz="4"/>
+              <w:bottom w:val="single" w:color="BFBFBF" w:sz="4"/>
+              <w:right w:val="single" w:color="BFBFBF" w:sz="4"/>
+            </w:tcBorders>
+            <w:tcMar>
+              <w:top w:type="dxa" w:w="60"/>
+              <w:left w:type="dxa" w:w="100"/>
+              <w:bottom w:type="dxa" w:w="60"/>
+              <w:right w:type="dxa" w:w="100"/>
+            </w:tcMar>
+          </w:tcPr>
+          <w:p>
+            <w:pPr>
+              <w:spacing w:after="20"/>
+            </w:pPr>
+            <w:r>
+              <w:rPr>
+                <w:rFonts w:ascii="Arial" w:cs="Arial" w:eastAsia="Arial" w:hAnsi="Arial"/>
+                <w:sz w:val="20"/>
+                <w:szCs w:val="20"/>
+              </w:rPr>
+              <w:t xml:space="preserve">Có cột "Duyệt KQ" nhưng khu kết quả không có nút</w:t>
+            </w:r>
+          </w:p>
+        </w:tc>
+        <w:tc>
+          <w:tcPr>
+            <w:tcW w:type="dxa" w:w="3181"/>
+            <w:tcBorders>
+              <w:top w:val="single" w:color="BFBFBF" w:sz="4"/>
+              <w:left w:val="single" w:color="BFBFBF" w:sz="4"/>
+              <w:bottom w:val="single" w:color="BFBFBF" w:sz="4"/>
+              <w:right w:val="single" w:color="BFBFBF" w:sz="4"/>
+            </w:tcBorders>
+            <w:tcMar>
+              <w:top w:type="dxa" w:w="60"/>
+              <w:left w:type="dxa" w:w="100"/>
+              <w:bottom w:type="dxa" w:w="60"/>
+              <w:right w:type="dxa" w:w="100"/>
+            </w:tcMar>
+          </w:tcPr>
+          <w:p>
+            <w:pPr>
+              <w:spacing w:after="20"/>
+            </w:pPr>
+            <w:r>
+              <w:rPr>
+                <w:rFonts w:ascii="Arial" w:cs="Arial" w:eastAsia="Arial" w:hAnsi="Arial"/>
+                <w:sz w:val="20"/>
+                <w:szCs w:val="20"/>
+              </w:rPr>
+              <w:t xml:space="preserve">Máy trạm đang chạy bản phần mềm cũ (chưa cập nhật plugin Kết nối xét nghiệm)</w:t>
+            </w:r>
+          </w:p>
+        </w:tc>
+        <w:tc>
+          <w:tcPr>
+            <w:tcW w:type="dxa" w:w="3180"/>
+            <w:tcBorders>
+              <w:top w:val="single" w:color="BFBFBF" w:sz="4"/>
+              <w:left w:val="single" w:color="BFBFBF" w:sz="4"/>
+              <w:bottom w:val="single" w:color="BFBFBF" w:sz="4"/>
+              <w:right w:val="single" w:color="BFBFBF" w:sz="4"/>
+            </w:tcBorders>
+            <w:tcMar>
+              <w:top w:type="dxa" w:w="60"/>
+              <w:left w:type="dxa" w:w="100"/>
+              <w:bottom w:type="dxa" w:w="60"/>
+              <w:right w:type="dxa" w:w="100"/>
+            </w:tcMar>
+          </w:tcPr>
+          <w:p>
+            <w:pPr>
+              <w:spacing w:after="20"/>
+            </w:pPr>
+            <w:r>
+              <w:rPr>
+                <w:rFonts w:ascii="Arial" w:cs="Arial" w:eastAsia="Arial" w:hAnsi="Arial"/>
+                <w:sz w:val="20"/>
+                <w:szCs w:val="20"/>
+              </w:rPr>
+              <w:t xml:space="preserve">Cập nhật phiên bản mới, khởi động lại phần mềm</w:t>
+            </w:r>
+          </w:p>
+        </w:tc>
+      </w:tr>
+      <w:tr>
+        <w:tc>
+          <w:tcPr>
+            <w:tcW w:type="dxa" w:w="3277"/>
+            <w:tcBorders>
+              <w:top w:val="single" w:color="BFBFBF" w:sz="4"/>
+              <w:left w:val="single" w:color="BFBFBF" w:sz="4"/>
+              <w:bottom w:val="single" w:color="BFBFBF" w:sz="4"/>
+              <w:right w:val="single" w:color="BFBFBF" w:sz="4"/>
+            </w:tcBorders>
+            <w:tcMar>
+              <w:top w:type="dxa" w:w="60"/>
+              <w:left w:type="dxa" w:w="100"/>
+              <w:bottom w:type="dxa" w:w="60"/>
+              <w:right w:type="dxa" w:w="100"/>
+            </w:tcMar>
+          </w:tcPr>
+          <w:p>
+            <w:pPr>
+              <w:spacing w:after="20"/>
+            </w:pPr>
+            <w:r>
+              <w:rPr>
+                <w:rFonts w:ascii="Arial" w:cs="Arial" w:eastAsia="Arial" w:hAnsi="Arial"/>
+                <w:sz w:val="20"/>
+                <w:szCs w:val="20"/>
+              </w:rPr>
+              <w:t xml:space="preserve">Thấy nút nhưng mờ</w:t>
+            </w:r>
+          </w:p>
+        </w:tc>
+        <w:tc>
+          <w:tcPr>
+            <w:tcW w:type="dxa" w:w="3181"/>
+            <w:tcBorders>
+              <w:top w:val="single" w:color="BFBFBF" w:sz="4"/>
+              <w:left w:val="single" w:color="BFBFBF" w:sz="4"/>
+              <w:bottom w:val="single" w:color="BFBFBF" w:sz="4"/>
+              <w:right w:val="single" w:color="BFBFBF" w:sz="4"/>
+            </w:tcBorders>
+            <w:tcMar>
+              <w:top w:type="dxa" w:w="60"/>
+              <w:left w:type="dxa" w:w="100"/>
+              <w:bottom w:type="dxa" w:w="60"/>
+              <w:right w:type="dxa" w:w="100"/>
+            </w:tcMar>
+          </w:tcPr>
+          <w:p>
+            <w:pPr>
+              <w:spacing w:after="20"/>
+            </w:pPr>
+            <w:r>
+              <w:rPr>
+                <w:rFonts w:ascii="Arial" w:cs="Arial" w:eastAsia="Arial" w:hAnsi="Arial"/>
+                <w:sz w:val="20"/>
+                <w:szCs w:val="20"/>
+              </w:rPr>
+              <w:t xml:space="preserve">Chưa chọn mẫu, hoặc mẫu chưa có kết quả, hoặc mẫu đã trả kết quả</w:t>
+            </w:r>
+          </w:p>
+        </w:tc>
+        <w:tc>
+          <w:tcPr>
+            <w:tcW w:type="dxa" w:w="3180"/>
+            <w:tcBorders>
+              <w:top w:val="single" w:color="BFBFBF" w:sz="4"/>
+              <w:left w:val="single" w:color="BFBFBF" w:sz="4"/>
+              <w:bottom w:val="single" w:color="BFBFBF" w:sz="4"/>
+              <w:right w:val="single" w:color="BFBFBF" w:sz="4"/>
+            </w:tcBorders>
+            <w:tcMar>
+              <w:top w:type="dxa" w:w="60"/>
+              <w:left w:type="dxa" w:w="100"/>
+              <w:bottom w:type="dxa" w:w="60"/>
+              <w:right w:type="dxa" w:w="100"/>
+            </w:tcMar>
+          </w:tcPr>
+          <w:p>
+            <w:pPr>
+              <w:spacing w:after="20"/>
+            </w:pPr>
+            <w:r>
+              <w:rPr>
+                <w:rFonts w:ascii="Arial" w:cs="Arial" w:eastAsia="Arial" w:hAnsi="Arial"/>
+                <w:sz w:val="20"/>
+                <w:szCs w:val="20"/>
+              </w:rPr>
+              <w:t xml:space="preserve">Chọn mẫu có kết quả; mẫu đã trả kết quả thì Hủy trả kết quả trước</w:t>
+            </w:r>
+          </w:p>
+        </w:tc>
+      </w:tr>
+      <w:tr>
+        <w:tc>
+          <w:tcPr>
+            <w:tcW w:type="dxa" w:w="3277"/>
+            <w:tcBorders>
+              <w:top w:val="single" w:color="BFBFBF" w:sz="4"/>
+              <w:left w:val="single" w:color="BFBFBF" w:sz="4"/>
+              <w:bottom w:val="single" w:color="BFBFBF" w:sz="4"/>
+              <w:right w:val="single" w:color="BFBFBF" w:sz="4"/>
+            </w:tcBorders>
+            <w:tcMar>
+              <w:top w:type="dxa" w:w="60"/>
+              <w:left w:type="dxa" w:w="100"/>
+              <w:bottom w:type="dxa" w:w="60"/>
+              <w:right w:type="dxa" w:w="100"/>
+            </w:tcMar>
+          </w:tcPr>
+          <w:p>
+            <w:pPr>
+              <w:spacing w:after="20"/>
+            </w:pPr>
+            <w:r>
+              <w:rPr>
+                <w:rFonts w:ascii="Arial" w:cs="Arial" w:eastAsia="Arial" w:hAnsi="Arial"/>
+                <w:sz w:val="20"/>
+                <w:szCs w:val="20"/>
+              </w:rPr>
+              <w:t xml:space="preserve">Không thấy 2 cột Người duyệt KQ / TG duyệt</w:t>
+            </w:r>
+          </w:p>
+        </w:tc>
+        <w:tc>
+          <w:tcPr>
+            <w:tcW w:type="dxa" w:w="3181"/>
+            <w:tcBorders>
+              <w:top w:val="single" w:color="BFBFBF" w:sz="4"/>
+              <w:left w:val="single" w:color="BFBFBF" w:sz="4"/>
+              <w:bottom w:val="single" w:color="BFBFBF" w:sz="4"/>
+              <w:right w:val="single" w:color="BFBFBF" w:sz="4"/>
+            </w:tcBorders>
+            <w:tcMar>
+              <w:top w:type="dxa" w:w="60"/>
+              <w:left w:type="dxa" w:w="100"/>
+              <w:bottom w:type="dxa" w:w="60"/>
+              <w:right w:type="dxa" w:w="100"/>
+            </w:tcMar>
+          </w:tcPr>
+          <w:p>
+            <w:pPr>
+              <w:spacing w:after="20"/>
+            </w:pPr>
+            <w:r>
+              <w:rPr>
+                <w:rFonts w:ascii="Arial" w:cs="Arial" w:eastAsia="Arial" w:hAnsi="Arial"/>
+                <w:sz w:val="20"/>
+                <w:szCs w:val="20"/>
+              </w:rPr>
+              <w:t xml:space="preserve">Cấu hình chưa bật, hoặc cột bị kéo hẹp / ẩn trên bảng chỉ số</w:t>
+            </w:r>
+          </w:p>
+        </w:tc>
+        <w:tc>
+          <w:tcPr>
+            <w:tcW w:type="dxa" w:w="3180"/>
+            <w:tcBorders>
+              <w:top w:val="single" w:color="BFBFBF" w:sz="4"/>
+              <w:left w:val="single" w:color="BFBFBF" w:sz="4"/>
+              <w:bottom w:val="single" w:color="BFBFBF" w:sz="4"/>
+              <w:right w:val="single" w:color="BFBFBF" w:sz="4"/>
+            </w:tcBorders>
+            <w:tcMar>
+              <w:top w:type="dxa" w:w="60"/>
+              <w:left w:type="dxa" w:w="100"/>
+              <w:bottom w:type="dxa" w:w="60"/>
+              <w:right w:type="dxa" w:w="100"/>
+            </w:tcMar>
+          </w:tcPr>
+          <w:p>
+            <w:pPr>
+              <w:spacing w:after="20"/>
+            </w:pPr>
+            <w:r>
+              <w:rPr>
+                <w:rFonts w:ascii="Arial" w:cs="Arial" w:eastAsia="Arial" w:hAnsi="Arial"/>
+                <w:sz w:val="20"/>
+                <w:szCs w:val="20"/>
+              </w:rPr>
+              <w:t xml:space="preserve">Kiểm tra cấu hình; kéo thanh cuộn ngang tới cuối bảng chỉ số</w:t>
+            </w:r>
+          </w:p>
+        </w:tc>
+      </w:tr>
+    </w:tbl>
+    <w:p>
+      <w:pPr>
         <w:pStyle w:val="Heading2"/>
         <w:spacing w:before="240" w:after="120"/>
       </w:pPr>
@@ -4312,7 +5310,7 @@
                 <w:sz w:val="20"/>
                 <w:szCs w:val="20"/>
               </w:rPr>
-              <w:t xml:space="preserve">Bật tính năng duyệt; bắt buộc duyệt trước khi trả kết quả (khuyến nghị)</w:t>
+              <w:t xml:space="preserve">Bật tính năng duyệt (hiện nút + 2 cột); bắt buộc duyệt trước khi trả kết quả (khuyến nghị)</w:t>
             </w:r>
           </w:p>
         </w:tc>
@@ -4404,7 +5402,7 @@
                 <w:sz w:val="20"/>
                 <w:szCs w:val="20"/>
               </w:rPr>
-              <w:t xml:space="preserve">Bật tính năng duyệt, không bắt buộc duyệt trước trả kết quả (hiện thêm cột Duyệt mẫu, Từ chối)</w:t>
+              <w:t xml:space="preserve">Bật tính năng duyệt (hiện nút + 2 cột), không bắt buộc duyệt trước trả kết quả (hiện thêm cột Duyệt mẫu, Từ chối)</w:t>
             </w:r>
           </w:p>
         </w:tc>

</xml_diff>

<commit_message>
ConnectionTest: nút Duyệt KQ / Hủy duyệt KQ luôn hiển thị như nút Duyệt KQ theo lô; 2 cột Người duyệt KQ, TG duyệt mặc định ẩn
- Bỏ điều kiện config MUST_APPROVE_RESULT_BEFORE_RETURN / IS_SHOW_BUTTON_APPROVE_SAMPLE: môi trường không nạp được config LIS (MOS.LIS.* chưa cấu hình LIS nội bộ) thì nút bị ẩn
- 2 cột người duyệt mặc định ẩn như các cột ẩn khác của cây chỉ số, bật qua Column Chooser, lưu bằng InitRestoreLayoutTreeListFromXml
- Cập nhật tài liệu A_NghiepVu, B_KyThuat, docs module

Co-Authored-By: Claude Opus 5.5 <noreply@anthropic.com>
</commit_message>
<xml_diff>
--- a/docs/A_NghiepVu_ConnectionTest_DuyetKetQua.docx
+++ b/docs/A_NghiepVu_ConnectionTest_DuyetKetQua.docx
@@ -2031,7 +2031,21 @@
         <w:rPr>
           <w:rFonts w:ascii="Arial" w:cs="Arial" w:eastAsia="Arial" w:hAnsi="Arial"/>
         </w:rPr>
-        <w:t xml:space="preserve">Nút chỉ hiển thị khi viện đang bật tính năng duyệt kết quả (cùng điều kiện với cột "Duyệt KQ" trên danh sách mẫu, xem mục 8). Nút không phân quyền: người dùng mở được màn hình Kết nối xét nghiệm là dùng được.</w:t>
+        <w:t xml:space="preserve">Nút </w:t>
+      </w:r>
+      <w:r>
+        <w:rPr>
+          <w:rFonts w:ascii="Arial" w:cs="Arial" w:eastAsia="Arial" w:hAnsi="Arial"/>
+          <w:b/>
+          <w:bCs/>
+        </w:rPr>
+        <w:t xml:space="preserve">luôn hiển thị</w:t>
+      </w:r>
+      <w:r>
+        <w:rPr>
+          <w:rFonts w:ascii="Arial" w:cs="Arial" w:eastAsia="Arial" w:hAnsi="Arial"/>
+        </w:rPr>
+        <w:t xml:space="preserve"> ở hàng nút dưới, giống nút "Duyệt KQ theo lô" — không phụ thuộc cấu hình. Nút không phân quyền: người dùng mở được màn hình Kết nối xét nghiệm là dùng được.</w:t>
       </w:r>
     </w:p>
     <w:p>
@@ -2043,60 +2057,7 @@
         <w:rPr>
           <w:rFonts w:ascii="Arial" w:cs="Arial" w:eastAsia="Arial" w:hAnsi="Arial"/>
         </w:rPr>
-        <w:t xml:space="preserve">Điều kiện hiển thị nút</w:t>
-      </w:r>
-    </w:p>
-    <w:p>
-      <w:pPr>
-        <w:spacing w:after="120"/>
-      </w:pPr>
-      <w:r>
-        <w:rPr>
-          <w:rFonts w:ascii="Arial" w:cs="Arial" w:eastAsia="Arial" w:hAnsi="Arial"/>
-        </w:rPr>
-        <w:t xml:space="preserve">Nút "Duyệt KQ / Hủy duyệt KQ" và 2 cột "Người duyệt KQ", "TG duyệt" </w:t>
-      </w:r>
-      <w:r>
-        <w:rPr>
-          <w:rFonts w:ascii="Arial" w:cs="Arial" w:eastAsia="Arial" w:hAnsi="Arial"/>
-          <w:b/>
-          <w:bCs/>
-        </w:rPr>
-        <w:t xml:space="preserve">chỉ hiển thị</w:t>
-      </w:r>
-      <w:r>
-        <w:rPr>
-          <w:rFonts w:ascii="Arial" w:cs="Arial" w:eastAsia="Arial" w:hAnsi="Arial"/>
-        </w:rPr>
-        <w:t xml:space="preserve"> khi </w:t>
-      </w:r>
-      <w:r>
-        <w:rPr>
-          <w:rFonts w:ascii="Arial" w:cs="Arial" w:eastAsia="Arial" w:hAnsi="Arial"/>
-          <w:b/>
-          <w:bCs/>
-        </w:rPr>
-        <w:t xml:space="preserve">một trong hai</w:t>
-      </w:r>
-      <w:r>
-        <w:rPr>
-          <w:rFonts w:ascii="Arial" w:cs="Arial" w:eastAsia="Arial" w:hAnsi="Arial"/>
-        </w:rPr>
-        <w:t xml:space="preserve"> cấu hình sau có giá trị </w:t>
-      </w:r>
-      <w:r>
-        <w:rPr>
-          <w:rFonts w:ascii="Arial" w:cs="Arial" w:eastAsia="Arial" w:hAnsi="Arial"/>
-          <w:b/>
-          <w:bCs/>
-        </w:rPr>
-        <w:t xml:space="preserve">1</w:t>
-      </w:r>
-      <w:r>
-        <w:rPr>
-          <w:rFonts w:ascii="Arial" w:cs="Arial" w:eastAsia="Arial" w:hAnsi="Arial"/>
-        </w:rPr>
-        <w:t xml:space="preserve">:</w:t>
+        <w:t xml:space="preserve">Điều kiện hiển thị</w:t>
       </w:r>
     </w:p>
     <w:tbl>
@@ -2112,9 +2073,9 @@
         </w:tblBorders>
       </w:tblPr>
       <w:tblGrid>
-        <w:gridCol w:w="4626"/>
-        <w:gridCol w:w="1157"/>
-        <w:gridCol w:w="3855"/>
+        <w:gridCol w:w="2891"/>
+        <w:gridCol w:w="3084"/>
+        <w:gridCol w:w="3663"/>
       </w:tblGrid>
       <w:tr>
         <w:trPr>
@@ -2122,7 +2083,7 @@
         </w:trPr>
         <w:tc>
           <w:tcPr>
-            <w:tcW w:type="dxa" w:w="4626"/>
+            <w:tcW w:type="dxa" w:w="2891"/>
             <w:tcBorders>
               <w:top w:val="single" w:color="BFBFBF" w:sz="4"/>
               <w:left w:val="single" w:color="BFBFBF" w:sz="4"/>
@@ -2149,13 +2110,13 @@
                 <w:sz w:val="20"/>
                 <w:szCs w:val="20"/>
               </w:rPr>
-              <w:t xml:space="preserve">Cấu hình</w:t>
-            </w:r>
-          </w:p>
-        </w:tc>
-        <w:tc>
-          <w:tcPr>
-            <w:tcW w:type="dxa" w:w="1157"/>
+              <w:t xml:space="preserve">Thành phần</w:t>
+            </w:r>
+          </w:p>
+        </w:tc>
+        <w:tc>
+          <w:tcPr>
+            <w:tcW w:type="dxa" w:w="3084"/>
             <w:tcBorders>
               <w:top w:val="single" w:color="BFBFBF" w:sz="4"/>
               <w:left w:val="single" w:color="BFBFBF" w:sz="4"/>
@@ -2182,13 +2143,13 @@
                 <w:sz w:val="20"/>
                 <w:szCs w:val="20"/>
               </w:rPr>
-              <w:t xml:space="preserve">Giá trị</w:t>
-            </w:r>
-          </w:p>
-        </w:tc>
-        <w:tc>
-          <w:tcPr>
-            <w:tcW w:type="dxa" w:w="3855"/>
+              <w:t xml:space="preserve">Hiển thị</w:t>
+            </w:r>
+          </w:p>
+        </w:tc>
+        <w:tc>
+          <w:tcPr>
+            <w:tcW w:type="dxa" w:w="3663"/>
             <w:tcBorders>
               <w:top w:val="single" w:color="BFBFBF" w:sz="4"/>
               <w:left w:val="single" w:color="BFBFBF" w:sz="4"/>
@@ -2215,7 +2176,7 @@
                 <w:sz w:val="20"/>
                 <w:szCs w:val="20"/>
               </w:rPr>
-              <w:t xml:space="preserve">Ý nghĩa</w:t>
+              <w:t xml:space="preserve">Ghi chú</w:t>
             </w:r>
           </w:p>
         </w:tc>
@@ -2223,91 +2184,91 @@
       <w:tr>
         <w:tc>
           <w:tcPr>
-            <w:tcW w:type="dxa" w:w="4626"/>
-            <w:tcBorders>
-              <w:top w:val="single" w:color="BFBFBF" w:sz="4"/>
-              <w:left w:val="single" w:color="BFBFBF" w:sz="4"/>
-              <w:bottom w:val="single" w:color="BFBFBF" w:sz="4"/>
-              <w:right w:val="single" w:color="BFBFBF" w:sz="4"/>
-            </w:tcBorders>
-            <w:tcMar>
-              <w:top w:type="dxa" w:w="60"/>
-              <w:left w:type="dxa" w:w="100"/>
-              <w:bottom w:type="dxa" w:w="60"/>
-              <w:right w:type="dxa" w:w="100"/>
-            </w:tcMar>
-          </w:tcPr>
-          <w:p>
-            <w:pPr>
-              <w:spacing w:after="20"/>
-            </w:pPr>
-            <w:r>
-              <w:rPr>
-                <w:rFonts w:ascii="Arial" w:cs="Arial" w:eastAsia="Arial" w:hAnsi="Arial"/>
-                <w:sz w:val="20"/>
-                <w:szCs w:val="20"/>
-              </w:rPr>
-              <w:t xml:space="preserve">LIS.LIS_SAMPLE.MUST_APPROVE_RESULT_BEFORE_RETURN</w:t>
-            </w:r>
-          </w:p>
-        </w:tc>
-        <w:tc>
-          <w:tcPr>
-            <w:tcW w:type="dxa" w:w="1157"/>
-            <w:tcBorders>
-              <w:top w:val="single" w:color="BFBFBF" w:sz="4"/>
-              <w:left w:val="single" w:color="BFBFBF" w:sz="4"/>
-              <w:bottom w:val="single" w:color="BFBFBF" w:sz="4"/>
-              <w:right w:val="single" w:color="BFBFBF" w:sz="4"/>
-            </w:tcBorders>
-            <w:tcMar>
-              <w:top w:type="dxa" w:w="60"/>
-              <w:left w:type="dxa" w:w="100"/>
-              <w:bottom w:type="dxa" w:w="60"/>
-              <w:right w:type="dxa" w:w="100"/>
-            </w:tcMar>
-          </w:tcPr>
-          <w:p>
-            <w:pPr>
-              <w:spacing w:after="20"/>
-            </w:pPr>
-            <w:r>
-              <w:rPr>
-                <w:rFonts w:ascii="Arial" w:cs="Arial" w:eastAsia="Arial" w:hAnsi="Arial"/>
-                <w:sz w:val="20"/>
-                <w:szCs w:val="20"/>
-              </w:rPr>
-              <w:t xml:space="preserve">1</w:t>
-            </w:r>
-          </w:p>
-        </w:tc>
-        <w:tc>
-          <w:tcPr>
-            <w:tcW w:type="dxa" w:w="3855"/>
-            <w:tcBorders>
-              <w:top w:val="single" w:color="BFBFBF" w:sz="4"/>
-              <w:left w:val="single" w:color="BFBFBF" w:sz="4"/>
-              <w:bottom w:val="single" w:color="BFBFBF" w:sz="4"/>
-              <w:right w:val="single" w:color="BFBFBF" w:sz="4"/>
-            </w:tcBorders>
-            <w:tcMar>
-              <w:top w:type="dxa" w:w="60"/>
-              <w:left w:type="dxa" w:w="100"/>
-              <w:bottom w:type="dxa" w:w="60"/>
-              <w:right w:type="dxa" w:w="100"/>
-            </w:tcMar>
-          </w:tcPr>
-          <w:p>
-            <w:pPr>
-              <w:spacing w:after="20"/>
-            </w:pPr>
-            <w:r>
-              <w:rPr>
-                <w:rFonts w:ascii="Arial" w:cs="Arial" w:eastAsia="Arial" w:hAnsi="Arial"/>
-                <w:sz w:val="20"/>
-                <w:szCs w:val="20"/>
-              </w:rPr>
-              <w:t xml:space="preserve">Bắt buộc duyệt kết quả rồi mới được trả kết quả</w:t>
+            <w:tcW w:type="dxa" w:w="2891"/>
+            <w:tcBorders>
+              <w:top w:val="single" w:color="BFBFBF" w:sz="4"/>
+              <w:left w:val="single" w:color="BFBFBF" w:sz="4"/>
+              <w:bottom w:val="single" w:color="BFBFBF" w:sz="4"/>
+              <w:right w:val="single" w:color="BFBFBF" w:sz="4"/>
+            </w:tcBorders>
+            <w:tcMar>
+              <w:top w:type="dxa" w:w="60"/>
+              <w:left w:type="dxa" w:w="100"/>
+              <w:bottom w:type="dxa" w:w="60"/>
+              <w:right w:type="dxa" w:w="100"/>
+            </w:tcMar>
+          </w:tcPr>
+          <w:p>
+            <w:pPr>
+              <w:spacing w:after="20"/>
+            </w:pPr>
+            <w:r>
+              <w:rPr>
+                <w:rFonts w:ascii="Arial" w:cs="Arial" w:eastAsia="Arial" w:hAnsi="Arial"/>
+                <w:sz w:val="20"/>
+                <w:szCs w:val="20"/>
+              </w:rPr>
+              <w:t xml:space="preserve">Nút "Duyệt KQ / Hủy duyệt KQ"</w:t>
+            </w:r>
+          </w:p>
+        </w:tc>
+        <w:tc>
+          <w:tcPr>
+            <w:tcW w:type="dxa" w:w="3084"/>
+            <w:tcBorders>
+              <w:top w:val="single" w:color="BFBFBF" w:sz="4"/>
+              <w:left w:val="single" w:color="BFBFBF" w:sz="4"/>
+              <w:bottom w:val="single" w:color="BFBFBF" w:sz="4"/>
+              <w:right w:val="single" w:color="BFBFBF" w:sz="4"/>
+            </w:tcBorders>
+            <w:tcMar>
+              <w:top w:type="dxa" w:w="60"/>
+              <w:left w:type="dxa" w:w="100"/>
+              <w:bottom w:type="dxa" w:w="60"/>
+              <w:right w:type="dxa" w:w="100"/>
+            </w:tcMar>
+          </w:tcPr>
+          <w:p>
+            <w:pPr>
+              <w:spacing w:after="20"/>
+            </w:pPr>
+            <w:r>
+              <w:rPr>
+                <w:rFonts w:ascii="Arial" w:cs="Arial" w:eastAsia="Arial" w:hAnsi="Arial"/>
+                <w:sz w:val="20"/>
+                <w:szCs w:val="20"/>
+              </w:rPr>
+              <w:t xml:space="preserve">Luôn hiển thị (như "Duyệt KQ theo lô")</w:t>
+            </w:r>
+          </w:p>
+        </w:tc>
+        <w:tc>
+          <w:tcPr>
+            <w:tcW w:type="dxa" w:w="3663"/>
+            <w:tcBorders>
+              <w:top w:val="single" w:color="BFBFBF" w:sz="4"/>
+              <w:left w:val="single" w:color="BFBFBF" w:sz="4"/>
+              <w:bottom w:val="single" w:color="BFBFBF" w:sz="4"/>
+              <w:right w:val="single" w:color="BFBFBF" w:sz="4"/>
+            </w:tcBorders>
+            <w:tcMar>
+              <w:top w:type="dxa" w:w="60"/>
+              <w:left w:type="dxa" w:w="100"/>
+              <w:bottom w:type="dxa" w:w="60"/>
+              <w:right w:type="dxa" w:w="100"/>
+            </w:tcMar>
+          </w:tcPr>
+          <w:p>
+            <w:pPr>
+              <w:spacing w:after="20"/>
+            </w:pPr>
+            <w:r>
+              <w:rPr>
+                <w:rFonts w:ascii="Arial" w:cs="Arial" w:eastAsia="Arial" w:hAnsi="Arial"/>
+                <w:sz w:val="20"/>
+                <w:szCs w:val="20"/>
+              </w:rPr>
+              <w:t xml:space="preserve">Mờ khi mẫu đang chọn không ở trạng thái được duyệt / hủy duyệt (bảng trên)</w:t>
             </w:r>
           </w:p>
         </w:tc>
@@ -2315,91 +2276,91 @@
       <w:tr>
         <w:tc>
           <w:tcPr>
-            <w:tcW w:type="dxa" w:w="4626"/>
-            <w:tcBorders>
-              <w:top w:val="single" w:color="BFBFBF" w:sz="4"/>
-              <w:left w:val="single" w:color="BFBFBF" w:sz="4"/>
-              <w:bottom w:val="single" w:color="BFBFBF" w:sz="4"/>
-              <w:right w:val="single" w:color="BFBFBF" w:sz="4"/>
-            </w:tcBorders>
-            <w:tcMar>
-              <w:top w:type="dxa" w:w="60"/>
-              <w:left w:type="dxa" w:w="100"/>
-              <w:bottom w:type="dxa" w:w="60"/>
-              <w:right w:type="dxa" w:w="100"/>
-            </w:tcMar>
-          </w:tcPr>
-          <w:p>
-            <w:pPr>
-              <w:spacing w:after="20"/>
-            </w:pPr>
-            <w:r>
-              <w:rPr>
-                <w:rFonts w:ascii="Arial" w:cs="Arial" w:eastAsia="Arial" w:hAnsi="Arial"/>
-                <w:sz w:val="20"/>
-                <w:szCs w:val="20"/>
-              </w:rPr>
-              <w:t xml:space="preserve">LIS.LIS_SAMPLE.IS_SHOW_BUTTON_APPROVE_SAMPLE</w:t>
-            </w:r>
-          </w:p>
-        </w:tc>
-        <w:tc>
-          <w:tcPr>
-            <w:tcW w:type="dxa" w:w="1157"/>
-            <w:tcBorders>
-              <w:top w:val="single" w:color="BFBFBF" w:sz="4"/>
-              <w:left w:val="single" w:color="BFBFBF" w:sz="4"/>
-              <w:bottom w:val="single" w:color="BFBFBF" w:sz="4"/>
-              <w:right w:val="single" w:color="BFBFBF" w:sz="4"/>
-            </w:tcBorders>
-            <w:tcMar>
-              <w:top w:type="dxa" w:w="60"/>
-              <w:left w:type="dxa" w:w="100"/>
-              <w:bottom w:type="dxa" w:w="60"/>
-              <w:right w:type="dxa" w:w="100"/>
-            </w:tcMar>
-          </w:tcPr>
-          <w:p>
-            <w:pPr>
-              <w:spacing w:after="20"/>
-            </w:pPr>
-            <w:r>
-              <w:rPr>
-                <w:rFonts w:ascii="Arial" w:cs="Arial" w:eastAsia="Arial" w:hAnsi="Arial"/>
-                <w:sz w:val="20"/>
-                <w:szCs w:val="20"/>
-              </w:rPr>
-              <w:t xml:space="preserve">1</w:t>
-            </w:r>
-          </w:p>
-        </w:tc>
-        <w:tc>
-          <w:tcPr>
-            <w:tcW w:type="dxa" w:w="3855"/>
-            <w:tcBorders>
-              <w:top w:val="single" w:color="BFBFBF" w:sz="4"/>
-              <w:left w:val="single" w:color="BFBFBF" w:sz="4"/>
-              <w:bottom w:val="single" w:color="BFBFBF" w:sz="4"/>
-              <w:right w:val="single" w:color="BFBFBF" w:sz="4"/>
-            </w:tcBorders>
-            <w:tcMar>
-              <w:top w:type="dxa" w:w="60"/>
-              <w:left w:type="dxa" w:w="100"/>
-              <w:bottom w:type="dxa" w:w="60"/>
-              <w:right w:type="dxa" w:w="100"/>
-            </w:tcMar>
-          </w:tcPr>
-          <w:p>
-            <w:pPr>
-              <w:spacing w:after="20"/>
-            </w:pPr>
-            <w:r>
-              <w:rPr>
-                <w:rFonts w:ascii="Arial" w:cs="Arial" w:eastAsia="Arial" w:hAnsi="Arial"/>
-                <w:sz w:val="20"/>
-                <w:szCs w:val="20"/>
-              </w:rPr>
-              <w:t xml:space="preserve">Hiện các nút duyệt (kèm cột Duyệt mẫu, Từ chối trên danh sách mẫu)</w:t>
+            <w:tcW w:type="dxa" w:w="2891"/>
+            <w:tcBorders>
+              <w:top w:val="single" w:color="BFBFBF" w:sz="4"/>
+              <w:left w:val="single" w:color="BFBFBF" w:sz="4"/>
+              <w:bottom w:val="single" w:color="BFBFBF" w:sz="4"/>
+              <w:right w:val="single" w:color="BFBFBF" w:sz="4"/>
+            </w:tcBorders>
+            <w:tcMar>
+              <w:top w:type="dxa" w:w="60"/>
+              <w:left w:type="dxa" w:w="100"/>
+              <w:bottom w:type="dxa" w:w="60"/>
+              <w:right w:type="dxa" w:w="100"/>
+            </w:tcMar>
+          </w:tcPr>
+          <w:p>
+            <w:pPr>
+              <w:spacing w:after="20"/>
+            </w:pPr>
+            <w:r>
+              <w:rPr>
+                <w:rFonts w:ascii="Arial" w:cs="Arial" w:eastAsia="Arial" w:hAnsi="Arial"/>
+                <w:sz w:val="20"/>
+                <w:szCs w:val="20"/>
+              </w:rPr>
+              <w:t xml:space="preserve">Cột "Người duyệt KQ", "TG duyệt"</w:t>
+            </w:r>
+          </w:p>
+        </w:tc>
+        <w:tc>
+          <w:tcPr>
+            <w:tcW w:type="dxa" w:w="3084"/>
+            <w:tcBorders>
+              <w:top w:val="single" w:color="BFBFBF" w:sz="4"/>
+              <w:left w:val="single" w:color="BFBFBF" w:sz="4"/>
+              <w:bottom w:val="single" w:color="BFBFBF" w:sz="4"/>
+              <w:right w:val="single" w:color="BFBFBF" w:sz="4"/>
+            </w:tcBorders>
+            <w:tcMar>
+              <w:top w:type="dxa" w:w="60"/>
+              <w:left w:type="dxa" w:w="100"/>
+              <w:bottom w:type="dxa" w:w="60"/>
+              <w:right w:type="dxa" w:w="100"/>
+            </w:tcMar>
+          </w:tcPr>
+          <w:p>
+            <w:pPr>
+              <w:spacing w:after="20"/>
+            </w:pPr>
+            <w:r>
+              <w:rPr>
+                <w:rFonts w:ascii="Arial" w:cs="Arial" w:eastAsia="Arial" w:hAnsi="Arial"/>
+                <w:sz w:val="20"/>
+                <w:szCs w:val="20"/>
+              </w:rPr>
+              <w:t xml:space="preserve">Mặc định ẩn, như các cột ẩn khác của bảng chỉ số</w:t>
+            </w:r>
+          </w:p>
+        </w:tc>
+        <w:tc>
+          <w:tcPr>
+            <w:tcW w:type="dxa" w:w="3663"/>
+            <w:tcBorders>
+              <w:top w:val="single" w:color="BFBFBF" w:sz="4"/>
+              <w:left w:val="single" w:color="BFBFBF" w:sz="4"/>
+              <w:bottom w:val="single" w:color="BFBFBF" w:sz="4"/>
+              <w:right w:val="single" w:color="BFBFBF" w:sz="4"/>
+            </w:tcBorders>
+            <w:tcMar>
+              <w:top w:type="dxa" w:w="60"/>
+              <w:left w:type="dxa" w:w="100"/>
+              <w:bottom w:type="dxa" w:w="60"/>
+              <w:right w:type="dxa" w:w="100"/>
+            </w:tcMar>
+          </w:tcPr>
+          <w:p>
+            <w:pPr>
+              <w:spacing w:after="20"/>
+            </w:pPr>
+            <w:r>
+              <w:rPr>
+                <w:rFonts w:ascii="Arial" w:cs="Arial" w:eastAsia="Arial" w:hAnsi="Arial"/>
+                <w:sz w:val="20"/>
+                <w:szCs w:val="20"/>
+              </w:rPr>
+              <w:t xml:space="preserve">Người dùng tự bật; phần mềm nhớ lựa chọn cho lần sau</w:t>
             </w:r>
           </w:p>
         </w:tc>
@@ -2412,126 +2373,69 @@
     </w:p>
     <w:p>
       <w:pPr>
-        <w:pStyle w:val="ListParagraph"/>
-        <w:numPr>
-          <w:ilvl w:val="0"/>
-          <w:numId w:val="2"/>
-        </w:numPr>
-        <w:spacing w:after="60"/>
-      </w:pPr>
-      <w:r>
-        <w:rPr>
-          <w:rFonts w:ascii="Arial" w:cs="Arial" w:eastAsia="Arial" w:hAnsi="Arial"/>
-        </w:rPr>
-        <w:t xml:space="preserve">Đây cũng là điều kiện hiện cột </w:t>
-      </w:r>
+        <w:spacing w:after="120"/>
+      </w:pPr>
       <w:r>
         <w:rPr>
           <w:rFonts w:ascii="Arial" w:cs="Arial" w:eastAsia="Arial" w:hAnsi="Arial"/>
           <w:b/>
           <w:bCs/>
         </w:rPr>
-        <w:t xml:space="preserve">"Duyệt KQ"</w:t>
-      </w:r>
-      <w:r>
-        <w:rPr>
-          <w:rFonts w:ascii="Arial" w:cs="Arial" w:eastAsia="Arial" w:hAnsi="Arial"/>
-        </w:rPr>
-        <w:t xml:space="preserve"> trên danh sách mẫu: có cột này thì cũng có nút ở khu kết quả.</w:t>
+        <w:t xml:space="preserve">Cách bật 2 cột:</w:t>
+      </w:r>
+      <w:r>
+        <w:rPr>
+          <w:rFonts w:ascii="Arial" w:cs="Arial" w:eastAsia="Arial" w:hAnsi="Arial"/>
+        </w:rPr>
+        <w:t xml:space="preserve"> nhấn chuột phải vào tiêu đề cột bất kỳ của bảng chỉ số → </w:t>
+      </w:r>
+      <w:r>
+        <w:rPr>
+          <w:rFonts w:ascii="Arial" w:cs="Arial" w:eastAsia="Arial" w:hAnsi="Arial"/>
+          <w:b/>
+          <w:bCs/>
+        </w:rPr>
+        <w:t xml:space="preserve">Column Chooser</w:t>
+      </w:r>
+      <w:r>
+        <w:rPr>
+          <w:rFonts w:ascii="Arial" w:cs="Arial" w:eastAsia="Arial" w:hAnsi="Arial"/>
+        </w:rPr>
+        <w:t xml:space="preserve"> (Chọn cột) → kéo "Người duyệt KQ" và "TG duyệt" thả vào hàng tiêu đề. Muốn ẩn lại: kéo cột ra khỏi hàng tiêu đề. Lựa chọn được ghi nhớ khi viện bật lưu bố cục bảng (cấu hình </w:t>
+      </w:r>
+      <w:r>
+        <w:rPr>
+          <w:rFonts w:ascii="Consolas" w:cs="Consolas" w:eastAsia="Consolas" w:hAnsi="Consolas"/>
+          <w:color w:val="7B2C2C"/>
+          <w:sz w:val="19"/>
+          <w:szCs w:val="19"/>
+        </w:rPr>
+        <w:t xml:space="preserve">HIS.Desktop.ApplyRestoreLayout.ModuleLinks</w:t>
+      </w:r>
+      <w:r>
+        <w:rPr>
+          <w:rFonts w:ascii="Arial" w:cs="Arial" w:eastAsia="Arial" w:hAnsi="Arial"/>
+        </w:rPr>
+        <w:t xml:space="preserve"> có </w:t>
+      </w:r>
+      <w:r>
+        <w:rPr>
+          <w:rFonts w:ascii="Consolas" w:cs="Consolas" w:eastAsia="Consolas" w:hAnsi="Consolas"/>
+          <w:color w:val="7B2C2C"/>
+          <w:sz w:val="19"/>
+          <w:szCs w:val="19"/>
+        </w:rPr>
+        <w:t xml:space="preserve">HIS.Desktop.Plugins.ConnectionTest</w:t>
+      </w:r>
+      <w:r>
+        <w:rPr>
+          <w:rFonts w:ascii="Arial" w:cs="Arial" w:eastAsia="Arial" w:hAnsi="Arial"/>
+        </w:rPr>
+        <w:t xml:space="preserve">).</w:t>
       </w:r>
     </w:p>
     <w:p>
       <w:pPr>
-        <w:pStyle w:val="ListParagraph"/>
-        <w:numPr>
-          <w:ilvl w:val="0"/>
-          <w:numId w:val="2"/>
-        </w:numPr>
-        <w:spacing w:after="60"/>
-      </w:pPr>
-      <w:r>
-        <w:rPr>
-          <w:rFonts w:ascii="Arial" w:cs="Arial" w:eastAsia="Arial" w:hAnsi="Arial"/>
-        </w:rPr>
-        <w:t xml:space="preserve">Cả 2 cấu hình khác 1 → </w:t>
-      </w:r>
-      <w:r>
-        <w:rPr>
-          <w:rFonts w:ascii="Arial" w:cs="Arial" w:eastAsia="Arial" w:hAnsi="Arial"/>
-          <w:b/>
-          <w:bCs/>
-        </w:rPr>
-        <w:t xml:space="preserve">ẩn</w:t>
-      </w:r>
-      <w:r>
-        <w:rPr>
-          <w:rFonts w:ascii="Arial" w:cs="Arial" w:eastAsia="Arial" w:hAnsi="Arial"/>
-        </w:rPr>
-        <w:t xml:space="preserve"> nút và 2 cột; màn hình giữ như trước.</w:t>
-      </w:r>
-    </w:p>
-    <w:p>
-      <w:pPr>
-        <w:pStyle w:val="ListParagraph"/>
-        <w:numPr>
-          <w:ilvl w:val="0"/>
-          <w:numId w:val="2"/>
-        </w:numPr>
-        <w:spacing w:after="60"/>
-      </w:pPr>
-      <w:r>
-        <w:rPr>
-          <w:rFonts w:ascii="Arial" w:cs="Arial" w:eastAsia="Arial" w:hAnsi="Arial"/>
-        </w:rPr>
-        <w:t xml:space="preserve">Cấu hình được đọc khi </w:t>
-      </w:r>
-      <w:r>
-        <w:rPr>
-          <w:rFonts w:ascii="Arial" w:cs="Arial" w:eastAsia="Arial" w:hAnsi="Arial"/>
-          <w:b/>
-          <w:bCs/>
-        </w:rPr>
-        <w:t xml:space="preserve">mở màn hình</w:t>
-      </w:r>
-      <w:r>
-        <w:rPr>
-          <w:rFonts w:ascii="Arial" w:cs="Arial" w:eastAsia="Arial" w:hAnsi="Arial"/>
-        </w:rPr>
-        <w:t xml:space="preserve">: sau khi đổi cấu hình phải đóng và mở lại màn hình Kết nối xét nghiệm.</w:t>
-      </w:r>
-    </w:p>
-    <w:p>
-      <w:pPr>
-        <w:pStyle w:val="ListParagraph"/>
-        <w:numPr>
-          <w:ilvl w:val="0"/>
-          <w:numId w:val="2"/>
-        </w:numPr>
-        <w:spacing w:after="60"/>
-      </w:pPr>
-      <w:r>
-        <w:rPr>
-          <w:rFonts w:ascii="Arial" w:cs="Arial" w:eastAsia="Arial" w:hAnsi="Arial"/>
-        </w:rPr>
-        <w:t xml:space="preserve">Khi đã hiển thị, nút </w:t>
-      </w:r>
-      <w:r>
-        <w:rPr>
-          <w:rFonts w:ascii="Arial" w:cs="Arial" w:eastAsia="Arial" w:hAnsi="Arial"/>
-          <w:b/>
-          <w:bCs/>
-        </w:rPr>
-        <w:t xml:space="preserve">mờ (không bấm được)</w:t>
-      </w:r>
-      <w:r>
-        <w:rPr>
-          <w:rFonts w:ascii="Arial" w:cs="Arial" w:eastAsia="Arial" w:hAnsi="Arial"/>
-        </w:rPr>
-        <w:t xml:space="preserve"> nếu mẫu đang chọn không ở trạng thái Đã chấp nhận / Có kết quả / Đã duyệt kết quả (xem bảng trên).</w:t>
-      </w:r>
-    </w:p>
-    <w:p>
-      <w:pPr>
         <w:pStyle w:val="Heading3"/>
         <w:spacing w:before="180" w:after="100"/>
       </w:pPr>
@@ -2539,7 +2443,7 @@
         <w:rPr>
           <w:rFonts w:ascii="Arial" w:cs="Arial" w:eastAsia="Arial" w:hAnsi="Arial"/>
         </w:rPr>
-        <w:t xml:space="preserve">Không thấy nút Duyệt KQ — cách kiểm tra</w:t>
+        <w:t xml:space="preserve">Không thấy nút / cột — cách kiểm tra</w:t>
       </w:r>
     </w:p>
     <w:tbl>
@@ -2690,7 +2594,7 @@
                 <w:sz w:val="20"/>
                 <w:szCs w:val="20"/>
               </w:rPr>
-              <w:t xml:space="preserve">Danh sách mẫu không có cột "Duyệt KQ", khu kết quả không có nút</w:t>
+              <w:t xml:space="preserve">Không có nút "Duyệt KQ" ở hàng nút dưới</w:t>
             </w:r>
           </w:p>
         </w:tc>
@@ -2720,7 +2624,7 @@
                 <w:sz w:val="20"/>
                 <w:szCs w:val="20"/>
               </w:rPr>
-              <w:t xml:space="preserve">Cả 2 cấu hình ở trên đang khác 1</w:t>
+              <w:t xml:space="preserve">Máy trạm đang chạy bản phần mềm cũ (chưa cập nhật plugin Kết nối xét nghiệm)</w:t>
             </w:r>
           </w:p>
         </w:tc>
@@ -2750,7 +2654,7 @@
                 <w:sz w:val="20"/>
                 <w:szCs w:val="20"/>
               </w:rPr>
-              <w:t xml:space="preserve">Bật 1 trong 2 cấu hình = 1 (khuyến nghị MUST_APPROVE_RESULT_BEFORE_RETURN), đóng và mở lại màn hình</w:t>
+              <w:t xml:space="preserve">Cập nhật phiên bản mới, khởi động lại phần mềm</w:t>
             </w:r>
           </w:p>
         </w:tc>
@@ -2782,7 +2686,7 @@
                 <w:sz w:val="20"/>
                 <w:szCs w:val="20"/>
               </w:rPr>
-              <w:t xml:space="preserve">Có cột "Duyệt KQ" nhưng khu kết quả không có nút</w:t>
+              <w:t xml:space="preserve">Thấy nút nhưng mờ</w:t>
             </w:r>
           </w:p>
         </w:tc>
@@ -2812,7 +2716,7 @@
                 <w:sz w:val="20"/>
                 <w:szCs w:val="20"/>
               </w:rPr>
-              <w:t xml:space="preserve">Máy trạm đang chạy bản phần mềm cũ (chưa cập nhật plugin Kết nối xét nghiệm)</w:t>
+              <w:t xml:space="preserve">Chưa chọn mẫu, hoặc mẫu chưa có kết quả, hoặc mẫu đã trả kết quả</w:t>
             </w:r>
           </w:p>
         </w:tc>
@@ -2842,7 +2746,7 @@
                 <w:sz w:val="20"/>
                 <w:szCs w:val="20"/>
               </w:rPr>
-              <w:t xml:space="preserve">Cập nhật phiên bản mới, khởi động lại phần mềm</w:t>
+              <w:t xml:space="preserve">Chọn mẫu có kết quả; mẫu đã trả kết quả thì Hủy trả kết quả trước</w:t>
             </w:r>
           </w:p>
         </w:tc>
@@ -2874,7 +2778,7 @@
                 <w:sz w:val="20"/>
                 <w:szCs w:val="20"/>
               </w:rPr>
-              <w:t xml:space="preserve">Thấy nút nhưng mờ</w:t>
+              <w:t xml:space="preserve">Không thấy 2 cột Người duyệt KQ / TG duyệt</w:t>
             </w:r>
           </w:p>
         </w:tc>
@@ -2904,7 +2808,7 @@
                 <w:sz w:val="20"/>
                 <w:szCs w:val="20"/>
               </w:rPr>
-              <w:t xml:space="preserve">Chưa chọn mẫu, hoặc mẫu chưa có kết quả, hoặc mẫu đã trả kết quả</w:t>
+              <w:t xml:space="preserve">Cột mặc định ẩn</w:t>
             </w:r>
           </w:p>
         </w:tc>
@@ -2934,99 +2838,7 @@
                 <w:sz w:val="20"/>
                 <w:szCs w:val="20"/>
               </w:rPr>
-              <w:t xml:space="preserve">Chọn mẫu có kết quả; mẫu đã trả kết quả thì Hủy trả kết quả trước</w:t>
-            </w:r>
-          </w:p>
-        </w:tc>
-      </w:tr>
-      <w:tr>
-        <w:tc>
-          <w:tcPr>
-            <w:tcW w:type="dxa" w:w="3277"/>
-            <w:tcBorders>
-              <w:top w:val="single" w:color="BFBFBF" w:sz="4"/>
-              <w:left w:val="single" w:color="BFBFBF" w:sz="4"/>
-              <w:bottom w:val="single" w:color="BFBFBF" w:sz="4"/>
-              <w:right w:val="single" w:color="BFBFBF" w:sz="4"/>
-            </w:tcBorders>
-            <w:tcMar>
-              <w:top w:type="dxa" w:w="60"/>
-              <w:left w:type="dxa" w:w="100"/>
-              <w:bottom w:type="dxa" w:w="60"/>
-              <w:right w:type="dxa" w:w="100"/>
-            </w:tcMar>
-          </w:tcPr>
-          <w:p>
-            <w:pPr>
-              <w:spacing w:after="20"/>
-            </w:pPr>
-            <w:r>
-              <w:rPr>
-                <w:rFonts w:ascii="Arial" w:cs="Arial" w:eastAsia="Arial" w:hAnsi="Arial"/>
-                <w:sz w:val="20"/>
-                <w:szCs w:val="20"/>
-              </w:rPr>
-              <w:t xml:space="preserve">Không thấy 2 cột Người duyệt KQ / TG duyệt</w:t>
-            </w:r>
-          </w:p>
-        </w:tc>
-        <w:tc>
-          <w:tcPr>
-            <w:tcW w:type="dxa" w:w="3181"/>
-            <w:tcBorders>
-              <w:top w:val="single" w:color="BFBFBF" w:sz="4"/>
-              <w:left w:val="single" w:color="BFBFBF" w:sz="4"/>
-              <w:bottom w:val="single" w:color="BFBFBF" w:sz="4"/>
-              <w:right w:val="single" w:color="BFBFBF" w:sz="4"/>
-            </w:tcBorders>
-            <w:tcMar>
-              <w:top w:type="dxa" w:w="60"/>
-              <w:left w:type="dxa" w:w="100"/>
-              <w:bottom w:type="dxa" w:w="60"/>
-              <w:right w:type="dxa" w:w="100"/>
-            </w:tcMar>
-          </w:tcPr>
-          <w:p>
-            <w:pPr>
-              <w:spacing w:after="20"/>
-            </w:pPr>
-            <w:r>
-              <w:rPr>
-                <w:rFonts w:ascii="Arial" w:cs="Arial" w:eastAsia="Arial" w:hAnsi="Arial"/>
-                <w:sz w:val="20"/>
-                <w:szCs w:val="20"/>
-              </w:rPr>
-              <w:t xml:space="preserve">Cấu hình chưa bật, hoặc cột bị kéo hẹp / ẩn trên bảng chỉ số</w:t>
-            </w:r>
-          </w:p>
-        </w:tc>
-        <w:tc>
-          <w:tcPr>
-            <w:tcW w:type="dxa" w:w="3180"/>
-            <w:tcBorders>
-              <w:top w:val="single" w:color="BFBFBF" w:sz="4"/>
-              <w:left w:val="single" w:color="BFBFBF" w:sz="4"/>
-              <w:bottom w:val="single" w:color="BFBFBF" w:sz="4"/>
-              <w:right w:val="single" w:color="BFBFBF" w:sz="4"/>
-            </w:tcBorders>
-            <w:tcMar>
-              <w:top w:type="dxa" w:w="60"/>
-              <w:left w:type="dxa" w:w="100"/>
-              <w:bottom w:type="dxa" w:w="60"/>
-              <w:right w:type="dxa" w:w="100"/>
-            </w:tcMar>
-          </w:tcPr>
-          <w:p>
-            <w:pPr>
-              <w:spacing w:after="20"/>
-            </w:pPr>
-            <w:r>
-              <w:rPr>
-                <w:rFonts w:ascii="Arial" w:cs="Arial" w:eastAsia="Arial" w:hAnsi="Arial"/>
-                <w:sz w:val="20"/>
-                <w:szCs w:val="20"/>
-              </w:rPr>
-              <w:t xml:space="preserve">Kiểm tra cấu hình; kéo thanh cuộn ngang tới cuối bảng chỉ số</w:t>
+              <w:t xml:space="preserve">Bật qua Column Chooser như hướng dẫn trên</w:t>
             </w:r>
           </w:p>
         </w:tc>
@@ -3058,6 +2870,20 @@
           <w:rFonts w:ascii="Arial" w:cs="Arial" w:eastAsia="Arial" w:hAnsi="Arial"/>
         </w:rPr>
         <w:t xml:space="preserve">Hai cột nằm ở cuối bảng chỉ số kết quả, </w:t>
+      </w:r>
+      <w:r>
+        <w:rPr>
+          <w:rFonts w:ascii="Arial" w:cs="Arial" w:eastAsia="Arial" w:hAnsi="Arial"/>
+          <w:b/>
+          <w:bCs/>
+        </w:rPr>
+        <w:t xml:space="preserve">mặc định ẩn</w:t>
+      </w:r>
+      <w:r>
+        <w:rPr>
+          <w:rFonts w:ascii="Arial" w:cs="Arial" w:eastAsia="Arial" w:hAnsi="Arial"/>
+        </w:rPr>
+        <w:t xml:space="preserve"> (bật qua Column Chooser, mục 4.1), </w:t>
       </w:r>
       <w:r>
         <w:rPr>
@@ -5280,7 +5106,7 @@
                 <w:sz w:val="20"/>
                 <w:szCs w:val="20"/>
               </w:rPr>
-              <w:t xml:space="preserve">1</w:t>
+              <w:t xml:space="preserve">1 (tùy chọn)</w:t>
             </w:r>
           </w:p>
         </w:tc>
@@ -5310,7 +5136,7 @@
                 <w:sz w:val="20"/>
                 <w:szCs w:val="20"/>
               </w:rPr>
-              <w:t xml:space="preserve">Bật tính năng duyệt (hiện nút + 2 cột); bắt buộc duyệt trước khi trả kết quả (khuyến nghị)</w:t>
+              <w:t xml:space="preserve">Bắt buộc duyệt kết quả trước khi trả kết quả. Không ảnh hưởng việc hiển thị nút</w:t>
             </w:r>
           </w:p>
         </w:tc>
@@ -5342,7 +5168,7 @@
                 <w:sz w:val="20"/>
                 <w:szCs w:val="20"/>
               </w:rPr>
-              <w:t xml:space="preserve">hoặc LIS.LIS_SAMPLE.IS_SHOW_BUTTON_APPROVE_SAMPLE</w:t>
+              <w:t xml:space="preserve">HIS.Desktop.ApplyRestoreLayout.ModuleLinks</w:t>
             </w:r>
           </w:p>
         </w:tc>
@@ -5372,7 +5198,7 @@
                 <w:sz w:val="20"/>
                 <w:szCs w:val="20"/>
               </w:rPr>
-              <w:t xml:space="preserve">1</w:t>
+              <w:t xml:space="preserve">Có HIS.Desktop.Plugins.ConnectionTest</w:t>
             </w:r>
           </w:p>
         </w:tc>
@@ -5402,7 +5228,7 @@
                 <w:sz w:val="20"/>
                 <w:szCs w:val="20"/>
               </w:rPr>
-              <w:t xml:space="preserve">Bật tính năng duyệt (hiện nút + 2 cột), không bắt buộc duyệt trước trả kết quả (hiện thêm cột Duyệt mẫu, Từ chối)</w:t>
+              <w:t xml:space="preserve">Ghi nhớ việc bật/ẩn 2 cột người duyệt trên bảng chỉ số</w:t>
             </w:r>
           </w:p>
         </w:tc>
@@ -5967,7 +5793,7 @@
                 <w:sz w:val="20"/>
                 <w:szCs w:val="20"/>
               </w:rPr>
-              <w:t xml:space="preserve">Bật tính năng bằng cấu hình nào (mục 8)?</w:t>
+              <w:t xml:space="preserve">Có bắt buộc duyệt trước khi trả kết quả (MUST_APPROVE_RESULT_BEFORE_RETURN = 1)?</w:t>
             </w:r>
           </w:p>
         </w:tc>
@@ -5997,7 +5823,7 @@
                 <w:sz w:val="20"/>
                 <w:szCs w:val="20"/>
               </w:rPr>
-              <w:t xml:space="preserve">MUST_APPROVE_RESULT_BEFORE_RETURN = 1</w:t>
+              <w:t xml:space="preserve">Tùy viện; nút Duyệt KQ luôn hiển thị dù chọn thế nào</w:t>
             </w:r>
           </w:p>
         </w:tc>
@@ -6713,7 +6539,7 @@
                 <w:sz w:val="20"/>
                 <w:szCs w:val="20"/>
               </w:rPr>
-              <w:t xml:space="preserve">Viện chưa bật cấu hình duyệt</w:t>
+              <w:t xml:space="preserve">Mở màn hình Kết nối xét nghiệm (mọi cấu hình)</w:t>
             </w:r>
           </w:p>
         </w:tc>
@@ -6743,7 +6569,7 @@
                 <w:sz w:val="20"/>
                 <w:szCs w:val="20"/>
               </w:rPr>
-              <w:t xml:space="preserve">Không thấy nút Duyệt KQ và 2 cột người duyệt</w:t>
+              <w:t xml:space="preserve">Có nút Duyệt KQ ở hàng nút dưới; 2 cột người duyệt ẩn, bật được qua Column Chooser và được nhớ lần sau</w:t>
             </w:r>
           </w:p>
         </w:tc>

</xml_diff>

<commit_message>
ConnectionTest docs (duyệt theo dịch vụ): bổ sung cấu hình HIS.Desktop.ApplyRestoreLayout.ModuleLinks để ghi nhớ 2 cột người duyệt (A_NghiepVu mục 4.2/8/11, B_KyThuat mục 5.6/7)
Co-Authored-By: Claude Opus 5.5 <noreply@anthropic.com>
</commit_message>
<xml_diff>
--- a/docs/A_NghiepVu_ConnectionTest_DuyetKetQua.docx
+++ b/docs/A_NghiepVu_ConnectionTest_DuyetKetQua.docx
@@ -2253,6 +2253,458 @@
     </w:p>
     <w:p>
       <w:pPr>
+        <w:pStyle w:val="Heading3"/>
+        <w:spacing w:before="180" w:after="100"/>
+      </w:pPr>
+      <w:r>
+        <w:rPr>
+          <w:rFonts w:ascii="Arial" w:cs="Arial" w:eastAsia="Arial" w:hAnsi="Arial"/>
+        </w:rPr>
+        <w:t xml:space="preserve">Ghi nhớ cột đã bật (cấu hình lưu bố cục)</w:t>
+      </w:r>
+    </w:p>
+    <w:p>
+      <w:pPr>
+        <w:spacing w:after="120"/>
+      </w:pPr>
+      <w:r>
+        <w:rPr>
+          <w:rFonts w:ascii="Arial" w:cs="Arial" w:eastAsia="Arial" w:hAnsi="Arial"/>
+        </w:rPr>
+        <w:t xml:space="preserve">Phần mềm chỉ nhớ việc bật / ẩn cột (và độ rộng, vị trí cột) của màn hình Kết nối xét nghiệm khi cấu hình hệ thống </w:t>
+      </w:r>
+      <w:r>
+        <w:rPr>
+          <w:rFonts w:ascii="Arial" w:cs="Arial" w:eastAsia="Arial" w:hAnsi="Arial"/>
+          <w:b/>
+          <w:bCs/>
+        </w:rPr>
+        <w:t xml:space="preserve">HIS.Desktop.ApplyRestoreLayout.ModuleLinks</w:t>
+      </w:r>
+      <w:r>
+        <w:rPr>
+          <w:rFonts w:ascii="Arial" w:cs="Arial" w:eastAsia="Arial" w:hAnsi="Arial"/>
+        </w:rPr>
+        <w:t xml:space="preserve"> có chứa </w:t>
+      </w:r>
+      <w:r>
+        <w:rPr>
+          <w:rFonts w:ascii="Arial" w:cs="Arial" w:eastAsia="Arial" w:hAnsi="Arial"/>
+          <w:b/>
+          <w:bCs/>
+        </w:rPr>
+        <w:t xml:space="preserve">HIS.Desktop.Plugins.ConnectionTest</w:t>
+      </w:r>
+      <w:r>
+        <w:rPr>
+          <w:rFonts w:ascii="Arial" w:cs="Arial" w:eastAsia="Arial" w:hAnsi="Arial"/>
+        </w:rPr>
+        <w:t xml:space="preserve">. Nếu chưa có, bật cột rồi mở lại màn hình sẽ mất.</w:t>
+      </w:r>
+    </w:p>
+    <w:tbl>
+      <w:tblPr>
+        <w:tblW w:type="dxa" w:w="9638"/>
+        <w:tblBorders>
+          <w:top w:val="single" w:color="auto" w:sz="4"/>
+          <w:left w:val="single" w:color="auto" w:sz="4"/>
+          <w:bottom w:val="single" w:color="auto" w:sz="4"/>
+          <w:right w:val="single" w:color="auto" w:sz="4"/>
+          <w:insideH w:val="single" w:color="auto" w:sz="4"/>
+          <w:insideV w:val="single" w:color="auto" w:sz="4"/>
+        </w:tblBorders>
+      </w:tblPr>
+      <w:tblGrid>
+        <w:gridCol w:w="964"/>
+        <w:gridCol w:w="8674"/>
+      </w:tblGrid>
+      <w:tr>
+        <w:trPr>
+          <w:tblHeader/>
+        </w:trPr>
+        <w:tc>
+          <w:tcPr>
+            <w:tcW w:type="dxa" w:w="964"/>
+            <w:tcBorders>
+              <w:top w:val="single" w:color="BFBFBF" w:sz="4"/>
+              <w:left w:val="single" w:color="BFBFBF" w:sz="4"/>
+              <w:bottom w:val="single" w:color="BFBFBF" w:sz="4"/>
+              <w:right w:val="single" w:color="BFBFBF" w:sz="4"/>
+            </w:tcBorders>
+            <w:shd w:fill="DCE6F1" w:color="auto" w:val="clear"/>
+            <w:tcMar>
+              <w:top w:type="dxa" w:w="60"/>
+              <w:left w:type="dxa" w:w="100"/>
+              <w:bottom w:type="dxa" w:w="60"/>
+              <w:right w:type="dxa" w:w="100"/>
+            </w:tcMar>
+          </w:tcPr>
+          <w:p>
+            <w:pPr>
+              <w:spacing w:after="20"/>
+            </w:pPr>
+            <w:r>
+              <w:rPr>
+                <w:rFonts w:ascii="Arial" w:cs="Arial" w:eastAsia="Arial" w:hAnsi="Arial"/>
+                <w:b/>
+                <w:bCs/>
+                <w:sz w:val="20"/>
+                <w:szCs w:val="20"/>
+              </w:rPr>
+              <w:t xml:space="preserve">Bước</w:t>
+            </w:r>
+          </w:p>
+        </w:tc>
+        <w:tc>
+          <w:tcPr>
+            <w:tcW w:type="dxa" w:w="8674"/>
+            <w:tcBorders>
+              <w:top w:val="single" w:color="BFBFBF" w:sz="4"/>
+              <w:left w:val="single" w:color="BFBFBF" w:sz="4"/>
+              <w:bottom w:val="single" w:color="BFBFBF" w:sz="4"/>
+              <w:right w:val="single" w:color="BFBFBF" w:sz="4"/>
+            </w:tcBorders>
+            <w:shd w:fill="DCE6F1" w:color="auto" w:val="clear"/>
+            <w:tcMar>
+              <w:top w:type="dxa" w:w="60"/>
+              <w:left w:type="dxa" w:w="100"/>
+              <w:bottom w:type="dxa" w:w="60"/>
+              <w:right w:type="dxa" w:w="100"/>
+            </w:tcMar>
+          </w:tcPr>
+          <w:p>
+            <w:pPr>
+              <w:spacing w:after="20"/>
+            </w:pPr>
+            <w:r>
+              <w:rPr>
+                <w:rFonts w:ascii="Arial" w:cs="Arial" w:eastAsia="Arial" w:hAnsi="Arial"/>
+                <w:b/>
+                <w:bCs/>
+                <w:sz w:val="20"/>
+                <w:szCs w:val="20"/>
+              </w:rPr>
+              <w:t xml:space="preserve">Thao tác</w:t>
+            </w:r>
+          </w:p>
+        </w:tc>
+      </w:tr>
+      <w:tr>
+        <w:tc>
+          <w:tcPr>
+            <w:tcW w:type="dxa" w:w="964"/>
+            <w:tcBorders>
+              <w:top w:val="single" w:color="BFBFBF" w:sz="4"/>
+              <w:left w:val="single" w:color="BFBFBF" w:sz="4"/>
+              <w:bottom w:val="single" w:color="BFBFBF" w:sz="4"/>
+              <w:right w:val="single" w:color="BFBFBF" w:sz="4"/>
+            </w:tcBorders>
+            <w:tcMar>
+              <w:top w:type="dxa" w:w="60"/>
+              <w:left w:type="dxa" w:w="100"/>
+              <w:bottom w:type="dxa" w:w="60"/>
+              <w:right w:type="dxa" w:w="100"/>
+            </w:tcMar>
+          </w:tcPr>
+          <w:p>
+            <w:pPr>
+              <w:spacing w:after="20"/>
+            </w:pPr>
+            <w:r>
+              <w:rPr>
+                <w:rFonts w:ascii="Arial" w:cs="Arial" w:eastAsia="Arial" w:hAnsi="Arial"/>
+                <w:sz w:val="20"/>
+                <w:szCs w:val="20"/>
+              </w:rPr>
+              <w:t xml:space="preserve">1</w:t>
+            </w:r>
+          </w:p>
+        </w:tc>
+        <w:tc>
+          <w:tcPr>
+            <w:tcW w:type="dxa" w:w="8674"/>
+            <w:tcBorders>
+              <w:top w:val="single" w:color="BFBFBF" w:sz="4"/>
+              <w:left w:val="single" w:color="BFBFBF" w:sz="4"/>
+              <w:bottom w:val="single" w:color="BFBFBF" w:sz="4"/>
+              <w:right w:val="single" w:color="BFBFBF" w:sz="4"/>
+            </w:tcBorders>
+            <w:tcMar>
+              <w:top w:type="dxa" w:w="60"/>
+              <w:left w:type="dxa" w:w="100"/>
+              <w:bottom w:type="dxa" w:w="60"/>
+              <w:right w:type="dxa" w:w="100"/>
+            </w:tcMar>
+          </w:tcPr>
+          <w:p>
+            <w:pPr>
+              <w:spacing w:after="20"/>
+            </w:pPr>
+            <w:r>
+              <w:rPr>
+                <w:rFonts w:ascii="Arial" w:cs="Arial" w:eastAsia="Arial" w:hAnsi="Arial"/>
+                <w:sz w:val="20"/>
+                <w:szCs w:val="20"/>
+              </w:rPr>
+              <w:t xml:space="preserve">Quản trị: thêm HIS.Desktop.Plugins.ConnectionTest vào giá trị cấu hình HIS.Desktop.ApplyRestoreLayout.ModuleLinks (các giá trị phân cách bằng dấu "," hoặc ";")</w:t>
+            </w:r>
+          </w:p>
+        </w:tc>
+      </w:tr>
+      <w:tr>
+        <w:tc>
+          <w:tcPr>
+            <w:tcW w:type="dxa" w:w="964"/>
+            <w:tcBorders>
+              <w:top w:val="single" w:color="BFBFBF" w:sz="4"/>
+              <w:left w:val="single" w:color="BFBFBF" w:sz="4"/>
+              <w:bottom w:val="single" w:color="BFBFBF" w:sz="4"/>
+              <w:right w:val="single" w:color="BFBFBF" w:sz="4"/>
+            </w:tcBorders>
+            <w:tcMar>
+              <w:top w:type="dxa" w:w="60"/>
+              <w:left w:type="dxa" w:w="100"/>
+              <w:bottom w:type="dxa" w:w="60"/>
+              <w:right w:type="dxa" w:w="100"/>
+            </w:tcMar>
+          </w:tcPr>
+          <w:p>
+            <w:pPr>
+              <w:spacing w:after="20"/>
+            </w:pPr>
+            <w:r>
+              <w:rPr>
+                <w:rFonts w:ascii="Arial" w:cs="Arial" w:eastAsia="Arial" w:hAnsi="Arial"/>
+                <w:sz w:val="20"/>
+                <w:szCs w:val="20"/>
+              </w:rPr>
+              <w:t xml:space="preserve">2</w:t>
+            </w:r>
+          </w:p>
+        </w:tc>
+        <w:tc>
+          <w:tcPr>
+            <w:tcW w:type="dxa" w:w="8674"/>
+            <w:tcBorders>
+              <w:top w:val="single" w:color="BFBFBF" w:sz="4"/>
+              <w:left w:val="single" w:color="BFBFBF" w:sz="4"/>
+              <w:bottom w:val="single" w:color="BFBFBF" w:sz="4"/>
+              <w:right w:val="single" w:color="BFBFBF" w:sz="4"/>
+            </w:tcBorders>
+            <w:tcMar>
+              <w:top w:type="dxa" w:w="60"/>
+              <w:left w:type="dxa" w:w="100"/>
+              <w:bottom w:type="dxa" w:w="60"/>
+              <w:right w:type="dxa" w:w="100"/>
+            </w:tcMar>
+          </w:tcPr>
+          <w:p>
+            <w:pPr>
+              <w:spacing w:after="20"/>
+            </w:pPr>
+            <w:r>
+              <w:rPr>
+                <w:rFonts w:ascii="Arial" w:cs="Arial" w:eastAsia="Arial" w:hAnsi="Arial"/>
+                <w:sz w:val="20"/>
+                <w:szCs w:val="20"/>
+              </w:rPr>
+              <w:t xml:space="preserve">Người dùng: đăng xuất và đăng nhập lại HIS</w:t>
+            </w:r>
+          </w:p>
+        </w:tc>
+      </w:tr>
+      <w:tr>
+        <w:tc>
+          <w:tcPr>
+            <w:tcW w:type="dxa" w:w="964"/>
+            <w:tcBorders>
+              <w:top w:val="single" w:color="BFBFBF" w:sz="4"/>
+              <w:left w:val="single" w:color="BFBFBF" w:sz="4"/>
+              <w:bottom w:val="single" w:color="BFBFBF" w:sz="4"/>
+              <w:right w:val="single" w:color="BFBFBF" w:sz="4"/>
+            </w:tcBorders>
+            <w:tcMar>
+              <w:top w:type="dxa" w:w="60"/>
+              <w:left w:type="dxa" w:w="100"/>
+              <w:bottom w:type="dxa" w:w="60"/>
+              <w:right w:type="dxa" w:w="100"/>
+            </w:tcMar>
+          </w:tcPr>
+          <w:p>
+            <w:pPr>
+              <w:spacing w:after="20"/>
+            </w:pPr>
+            <w:r>
+              <w:rPr>
+                <w:rFonts w:ascii="Arial" w:cs="Arial" w:eastAsia="Arial" w:hAnsi="Arial"/>
+                <w:sz w:val="20"/>
+                <w:szCs w:val="20"/>
+              </w:rPr>
+              <w:t xml:space="preserve">3</w:t>
+            </w:r>
+          </w:p>
+        </w:tc>
+        <w:tc>
+          <w:tcPr>
+            <w:tcW w:type="dxa" w:w="8674"/>
+            <w:tcBorders>
+              <w:top w:val="single" w:color="BFBFBF" w:sz="4"/>
+              <w:left w:val="single" w:color="BFBFBF" w:sz="4"/>
+              <w:bottom w:val="single" w:color="BFBFBF" w:sz="4"/>
+              <w:right w:val="single" w:color="BFBFBF" w:sz="4"/>
+            </w:tcBorders>
+            <w:tcMar>
+              <w:top w:type="dxa" w:w="60"/>
+              <w:left w:type="dxa" w:w="100"/>
+              <w:bottom w:type="dxa" w:w="60"/>
+              <w:right w:type="dxa" w:w="100"/>
+            </w:tcMar>
+          </w:tcPr>
+          <w:p>
+            <w:pPr>
+              <w:spacing w:after="20"/>
+            </w:pPr>
+            <w:r>
+              <w:rPr>
+                <w:rFonts w:ascii="Arial" w:cs="Arial" w:eastAsia="Arial" w:hAnsi="Arial"/>
+                <w:sz w:val="20"/>
+                <w:szCs w:val="20"/>
+              </w:rPr>
+              <w:t xml:space="preserve">Mở Kết nối xét nghiệm → chuột phải tiêu đề cột → Column Chooser → kéo "Người duyệt KQ", "TG duyệt" vào hàng tiêu đề (chỉ cần làm 1 lần)</w:t>
+            </w:r>
+          </w:p>
+        </w:tc>
+      </w:tr>
+      <w:tr>
+        <w:tc>
+          <w:tcPr>
+            <w:tcW w:type="dxa" w:w="964"/>
+            <w:tcBorders>
+              <w:top w:val="single" w:color="BFBFBF" w:sz="4"/>
+              <w:left w:val="single" w:color="BFBFBF" w:sz="4"/>
+              <w:bottom w:val="single" w:color="BFBFBF" w:sz="4"/>
+              <w:right w:val="single" w:color="BFBFBF" w:sz="4"/>
+            </w:tcBorders>
+            <w:tcMar>
+              <w:top w:type="dxa" w:w="60"/>
+              <w:left w:type="dxa" w:w="100"/>
+              <w:bottom w:type="dxa" w:w="60"/>
+              <w:right w:type="dxa" w:w="100"/>
+            </w:tcMar>
+          </w:tcPr>
+          <w:p>
+            <w:pPr>
+              <w:spacing w:after="20"/>
+            </w:pPr>
+            <w:r>
+              <w:rPr>
+                <w:rFonts w:ascii="Arial" w:cs="Arial" w:eastAsia="Arial" w:hAnsi="Arial"/>
+                <w:sz w:val="20"/>
+                <w:szCs w:val="20"/>
+              </w:rPr>
+              <w:t xml:space="preserve">4</w:t>
+            </w:r>
+          </w:p>
+        </w:tc>
+        <w:tc>
+          <w:tcPr>
+            <w:tcW w:type="dxa" w:w="8674"/>
+            <w:tcBorders>
+              <w:top w:val="single" w:color="BFBFBF" w:sz="4"/>
+              <w:left w:val="single" w:color="BFBFBF" w:sz="4"/>
+              <w:bottom w:val="single" w:color="BFBFBF" w:sz="4"/>
+              <w:right w:val="single" w:color="BFBFBF" w:sz="4"/>
+            </w:tcBorders>
+            <w:tcMar>
+              <w:top w:type="dxa" w:w="60"/>
+              <w:left w:type="dxa" w:w="100"/>
+              <w:bottom w:type="dxa" w:w="60"/>
+              <w:right w:type="dxa" w:w="100"/>
+            </w:tcMar>
+          </w:tcPr>
+          <w:p>
+            <w:pPr>
+              <w:spacing w:after="20"/>
+            </w:pPr>
+            <w:r>
+              <w:rPr>
+                <w:rFonts w:ascii="Arial" w:cs="Arial" w:eastAsia="Arial" w:hAnsi="Arial"/>
+                <w:sz w:val="20"/>
+                <w:szCs w:val="20"/>
+              </w:rPr>
+              <w:t xml:space="preserve">Đóng / mở lại màn hình: 2 cột vẫn hiển thị</w:t>
+            </w:r>
+          </w:p>
+        </w:tc>
+      </w:tr>
+    </w:tbl>
+    <w:p>
+      <w:pPr>
+        <w:spacing w:after="120"/>
+      </w:pPr>
+    </w:p>
+    <w:p>
+      <w:pPr>
+        <w:pStyle w:val="ListParagraph"/>
+        <w:numPr>
+          <w:ilvl w:val="0"/>
+          <w:numId w:val="2"/>
+        </w:numPr>
+        <w:spacing w:after="60"/>
+      </w:pPr>
+      <w:r>
+        <w:rPr>
+          <w:rFonts w:ascii="Arial" w:cs="Arial" w:eastAsia="Arial" w:hAnsi="Arial"/>
+        </w:rPr>
+        <w:t xml:space="preserve">Bố cục được lưu </w:t>
+      </w:r>
+      <w:r>
+        <w:rPr>
+          <w:rFonts w:ascii="Arial" w:cs="Arial" w:eastAsia="Arial" w:hAnsi="Arial"/>
+          <w:b/>
+          <w:bCs/>
+        </w:rPr>
+        <w:t xml:space="preserve">theo từng máy trạm</w:t>
+      </w:r>
+      <w:r>
+        <w:rPr>
+          <w:rFonts w:ascii="Arial" w:cs="Arial" w:eastAsia="Arial" w:hAnsi="Arial"/>
+        </w:rPr>
+        <w:t xml:space="preserve">: máy khác cần tự bật 1 lần.</w:t>
+      </w:r>
+    </w:p>
+    <w:p>
+      <w:pPr>
+        <w:pStyle w:val="ListParagraph"/>
+        <w:numPr>
+          <w:ilvl w:val="0"/>
+          <w:numId w:val="2"/>
+        </w:numPr>
+        <w:spacing w:after="60"/>
+      </w:pPr>
+      <w:r>
+        <w:rPr>
+          <w:rFonts w:ascii="Arial" w:cs="Arial" w:eastAsia="Arial" w:hAnsi="Arial"/>
+        </w:rPr>
+        <w:t xml:space="preserve">Khi bật cấu hình này, </w:t>
+      </w:r>
+      <w:r>
+        <w:rPr>
+          <w:rFonts w:ascii="Arial" w:cs="Arial" w:eastAsia="Arial" w:hAnsi="Arial"/>
+          <w:b/>
+          <w:bCs/>
+        </w:rPr>
+        <w:t xml:space="preserve">mọi</w:t>
+      </w:r>
+      <w:r>
+        <w:rPr>
+          <w:rFonts w:ascii="Arial" w:cs="Arial" w:eastAsia="Arial" w:hAnsi="Arial"/>
+        </w:rPr>
+        <w:t xml:space="preserve"> lưới / bảng của màn hình Kết nối xét nghiệm đều được ghi nhớ độ rộng, vị trí, ẩn/hiện cột.</w:t>
+      </w:r>
+    </w:p>
+    <w:p>
+      <w:pPr>
         <w:pStyle w:val="Heading2"/>
         <w:spacing w:before="240" w:after="120"/>
       </w:pPr>
@@ -4713,7 +5165,7 @@
                 <w:sz w:val="20"/>
                 <w:szCs w:val="20"/>
               </w:rPr>
-              <w:t xml:space="preserve">Không bắt buộc. HIS.Desktop.ApplyRestoreLayout.ModuleLinks có HIS.Desktop.Plugins.ConnectionTest để nhớ việc bật 2 cột.</w:t>
+              <w:t xml:space="preserve">Khuyến nghị: thêm HIS.Desktop.Plugins.ConnectionTest vào HIS.Desktop.ApplyRestoreLayout.ModuleLinks để phần mềm nhớ việc bật 2 cột (xem mục 4.2). Không bật thì 2 cột vẫn dùng được nhưng mỗi lần mở màn hình phải bật lại.</w:t>
             </w:r>
           </w:p>
         </w:tc>
@@ -5686,6 +6138,120 @@
                 <w:szCs w:val="20"/>
               </w:rPr>
               <w:t xml:space="preserve">Có nút Duyệt KQ ở hàng nút dưới; 2 cột người duyệt ẩn, bật được qua Column Chooser</w:t>
+            </w:r>
+          </w:p>
+        </w:tc>
+        <w:tc>
+          <w:tcPr>
+            <w:tcW w:type="dxa" w:w="964"/>
+            <w:tcBorders>
+              <w:top w:val="single" w:color="BFBFBF" w:sz="4"/>
+              <w:left w:val="single" w:color="BFBFBF" w:sz="4"/>
+              <w:bottom w:val="single" w:color="BFBFBF" w:sz="4"/>
+              <w:right w:val="single" w:color="BFBFBF" w:sz="4"/>
+            </w:tcBorders>
+            <w:tcMar>
+              <w:top w:type="dxa" w:w="60"/>
+              <w:left w:type="dxa" w:w="100"/>
+              <w:bottom w:type="dxa" w:w="60"/>
+              <w:right w:type="dxa" w:w="100"/>
+            </w:tcMar>
+          </w:tcPr>
+          <w:p>
+            <w:pPr>
+              <w:spacing w:after="20"/>
+            </w:pPr>
+          </w:p>
+        </w:tc>
+      </w:tr>
+      <w:tr>
+        <w:tc>
+          <w:tcPr>
+            <w:tcW w:type="dxa" w:w="578"/>
+            <w:tcBorders>
+              <w:top w:val="single" w:color="BFBFBF" w:sz="4"/>
+              <w:left w:val="single" w:color="BFBFBF" w:sz="4"/>
+              <w:bottom w:val="single" w:color="BFBFBF" w:sz="4"/>
+              <w:right w:val="single" w:color="BFBFBF" w:sz="4"/>
+            </w:tcBorders>
+            <w:tcMar>
+              <w:top w:type="dxa" w:w="60"/>
+              <w:left w:type="dxa" w:w="100"/>
+              <w:bottom w:type="dxa" w:w="60"/>
+              <w:right w:type="dxa" w:w="100"/>
+            </w:tcMar>
+          </w:tcPr>
+          <w:p>
+            <w:pPr>
+              <w:spacing w:after="20"/>
+            </w:pPr>
+            <w:r>
+              <w:rPr>
+                <w:rFonts w:ascii="Arial" w:cs="Arial" w:eastAsia="Arial" w:hAnsi="Arial"/>
+                <w:sz w:val="20"/>
+                <w:szCs w:val="20"/>
+              </w:rPr>
+              <w:t xml:space="preserve">1b</w:t>
+            </w:r>
+          </w:p>
+        </w:tc>
+        <w:tc>
+          <w:tcPr>
+            <w:tcW w:type="dxa" w:w="3277"/>
+            <w:tcBorders>
+              <w:top w:val="single" w:color="BFBFBF" w:sz="4"/>
+              <w:left w:val="single" w:color="BFBFBF" w:sz="4"/>
+              <w:bottom w:val="single" w:color="BFBFBF" w:sz="4"/>
+              <w:right w:val="single" w:color="BFBFBF" w:sz="4"/>
+            </w:tcBorders>
+            <w:tcMar>
+              <w:top w:type="dxa" w:w="60"/>
+              <w:left w:type="dxa" w:w="100"/>
+              <w:bottom w:type="dxa" w:w="60"/>
+              <w:right w:type="dxa" w:w="100"/>
+            </w:tcMar>
+          </w:tcPr>
+          <w:p>
+            <w:pPr>
+              <w:spacing w:after="20"/>
+            </w:pPr>
+            <w:r>
+              <w:rPr>
+                <w:rFonts w:ascii="Arial" w:cs="Arial" w:eastAsia="Arial" w:hAnsi="Arial"/>
+                <w:sz w:val="20"/>
+                <w:szCs w:val="20"/>
+              </w:rPr>
+              <w:t xml:space="preserve">Đã thêm ConnectionTest vào HIS.Desktop.ApplyRestoreLayout.ModuleLinks, bật 2 cột, mở lại màn hình</w:t>
+            </w:r>
+          </w:p>
+        </w:tc>
+        <w:tc>
+          <w:tcPr>
+            <w:tcW w:type="dxa" w:w="4819"/>
+            <w:tcBorders>
+              <w:top w:val="single" w:color="BFBFBF" w:sz="4"/>
+              <w:left w:val="single" w:color="BFBFBF" w:sz="4"/>
+              <w:bottom w:val="single" w:color="BFBFBF" w:sz="4"/>
+              <w:right w:val="single" w:color="BFBFBF" w:sz="4"/>
+            </w:tcBorders>
+            <w:tcMar>
+              <w:top w:type="dxa" w:w="60"/>
+              <w:left w:type="dxa" w:w="100"/>
+              <w:bottom w:type="dxa" w:w="60"/>
+              <w:right w:type="dxa" w:w="100"/>
+            </w:tcMar>
+          </w:tcPr>
+          <w:p>
+            <w:pPr>
+              <w:spacing w:after="20"/>
+            </w:pPr>
+            <w:r>
+              <w:rPr>
+                <w:rFonts w:ascii="Arial" w:cs="Arial" w:eastAsia="Arial" w:hAnsi="Arial"/>
+                <w:sz w:val="20"/>
+                <w:szCs w:val="20"/>
+              </w:rPr>
+              <w:t xml:space="preserve">2 cột vẫn hiển thị</w:t>
             </w:r>
           </w:p>
         </w:tc>

</xml_diff>

<commit_message>
ConnectionTest: thêm cấu hình HIS.Desktop.Plugins.ConnectionTest.IsApproveResultByService bật/tắt Duyệt KQ theo dịch vụ (mặc định tắt, giữ nghiệp vụ cũ)
- Tắt: ẩn nút Duyệt KQ, ẩn 2 cột Người duyệt KQ / TG duyệt (không hiện trong Column Chooser), không gọi api/LisSampleService/Get, không khóa ô theo dịch vụ, không đồng bộ cây sau Duyệt KQ cấp mẫu
- SQL thêm key vào HIS_CONFIG: docs/SQL_ConnectionTest_DuyetKetQuaTheoDichVu_Config.sql (CONFIG_CODE tạm)
- Cập nhật A_NghiepVu, B_KyThuat, docs module

Co-Authored-By: Claude Opus 5.5 <noreply@anthropic.com>
</commit_message>
<xml_diff>
--- a/docs/A_NghiepVu_ConnectionTest_DuyetKetQua.docx
+++ b/docs/A_NghiepVu_ConnectionTest_DuyetKetQua.docx
@@ -1433,35 +1433,77 @@
         <w:rPr>
           <w:rFonts w:ascii="Arial" w:cs="Arial" w:eastAsia="Arial" w:hAnsi="Arial"/>
         </w:rPr>
-        <w:t xml:space="preserve">Nút </w:t>
-      </w:r>
-      <w:r>
-        <w:rPr>
-          <w:rFonts w:ascii="Arial" w:cs="Arial" w:eastAsia="Arial" w:hAnsi="Arial"/>
+        <w:t xml:space="preserve">Tính năng </w:t>
+      </w:r>
+      <w:r>
+        <w:rPr>
           <w:b/>
           <w:bCs/>
-        </w:rPr>
-        <w:t xml:space="preserve">luôn hiển thị</w:t>
-      </w:r>
-      <w:r>
-        <w:rPr>
-          <w:rFonts w:ascii="Arial" w:cs="Arial" w:eastAsia="Arial" w:hAnsi="Arial"/>
-        </w:rPr>
-        <w:t xml:space="preserve"> ở hàng nút dưới khu vực kết quả (giống nút "Duyệt KQ theo lô"), không phụ thuộc cấu hình, không phân quyền. Nút áp dụng cho </w:t>
-      </w:r>
-      <w:r>
-        <w:rPr>
-          <w:rFonts w:ascii="Arial" w:cs="Arial" w:eastAsia="Arial" w:hAnsi="Arial"/>
+          <w:rFonts w:ascii="Arial" w:cs="Arial" w:eastAsia="Arial" w:hAnsi="Arial"/>
+        </w:rPr>
+        <w:t xml:space="preserve">bật / tắt bằng cấu hình</w:t>
+      </w:r>
+      <w:r>
+        <w:rPr>
+          <w:rFonts w:ascii="Arial" w:cs="Arial" w:eastAsia="Arial" w:hAnsi="Arial"/>
+        </w:rPr>
+        <w:t xml:space="preserve"> HIS.Desktop.Plugins.ConnectionTest.IsApproveResultByService: </w:t>
+      </w:r>
+      <w:r>
+        <w:rPr>
           <w:b/>
           <w:bCs/>
-        </w:rPr>
-        <w:t xml:space="preserve">các dịch vụ đang được tích</w:t>
-      </w:r>
-      <w:r>
-        <w:rPr>
-          <w:rFonts w:ascii="Arial" w:cs="Arial" w:eastAsia="Arial" w:hAnsi="Arial"/>
-        </w:rPr>
-        <w:t xml:space="preserve"> trên bảng chỉ số (tích dòng chỉ số được tính là tích dịch vụ của chỉ số đó; dịch vụ "Không thực hiện" bị bỏ qua).</w:t>
+          <w:rFonts w:ascii="Arial" w:cs="Arial" w:eastAsia="Arial" w:hAnsi="Arial"/>
+        </w:rPr>
+        <w:t xml:space="preserve">= 1</w:t>
+      </w:r>
+      <w:r>
+        <w:rPr>
+          <w:rFonts w:ascii="Arial" w:cs="Arial" w:eastAsia="Arial" w:hAnsi="Arial"/>
+        </w:rPr>
+        <w:t xml:space="preserve"> thì bật; </w:t>
+      </w:r>
+      <w:r>
+        <w:rPr>
+          <w:b/>
+          <w:bCs/>
+          <w:rFonts w:ascii="Arial" w:cs="Arial" w:eastAsia="Arial" w:hAnsi="Arial"/>
+        </w:rPr>
+        <w:t xml:space="preserve">trống hoặc khác 1 (mặc định)</w:t>
+      </w:r>
+      <w:r>
+        <w:rPr>
+          <w:rFonts w:ascii="Arial" w:cs="Arial" w:eastAsia="Arial" w:hAnsi="Arial"/>
+        </w:rPr>
+        <w:t xml:space="preserve"> thì tắt — ẩn nút và 2 cột, màn hình </w:t>
+      </w:r>
+      <w:r>
+        <w:rPr>
+          <w:b/>
+          <w:bCs/>
+          <w:rFonts w:ascii="Arial" w:cs="Arial" w:eastAsia="Arial" w:hAnsi="Arial"/>
+        </w:rPr>
+        <w:t xml:space="preserve">giữ nguyên nghiệp vụ cũ</w:t>
+      </w:r>
+      <w:r>
+        <w:rPr>
+          <w:rFonts w:ascii="Arial" w:cs="Arial" w:eastAsia="Arial" w:hAnsi="Arial"/>
+        </w:rPr>
+        <w:t xml:space="preserve">. Khi bật, nút </w:t>
+      </w:r>
+      <w:r>
+        <w:rPr>
+          <w:b/>
+          <w:bCs/>
+          <w:rFonts w:ascii="Arial" w:cs="Arial" w:eastAsia="Arial" w:hAnsi="Arial"/>
+        </w:rPr>
+        <w:t xml:space="preserve">luôn hiển thị</w:t>
+      </w:r>
+      <w:r>
+        <w:rPr>
+          <w:rFonts w:ascii="Arial" w:cs="Arial" w:eastAsia="Arial" w:hAnsi="Arial"/>
+        </w:rPr>
+        <w:t xml:space="preserve"> ở hàng nút dưới khu vực kết quả (giống nút "Duyệt KQ theo lô"), không phân quyền. Nút áp dụng cho các dịch vụ đang được tích trên bảng chỉ số (tích dòng chỉ số được tính là tích dịch vụ của chỉ số đó; dịch vụ "Không thực hiện" bị bỏ qua).</w:t>
       </w:r>
     </w:p>
     <w:tbl>
@@ -3853,7 +3895,7 @@
                 <w:sz w:val="20"/>
                 <w:szCs w:val="20"/>
               </w:rPr>
-              <w:t xml:space="preserve">Không phân quyền riêng cho nút; nút luôn hiển thị.</w:t>
+              <w:t xml:space="preserve">Bật / tắt bằng cấu hình HIS.Desktop.Plugins.ConnectionTest.IsApproveResultByService (mặc định tắt = nghiệp vụ cũ). Khi bật: nút luôn hiển thị, không phân quyền riêng.</w:t>
             </w:r>
           </w:p>
         </w:tc>
@@ -5042,6 +5084,68 @@
                 <w:szCs w:val="20"/>
               </w:rPr>
               <w:t xml:space="preserve">Cập nhật plugin Kết nối xét nghiệm + Mps000096 + Mps000517.</w:t>
+            </w:r>
+          </w:p>
+        </w:tc>
+      </w:tr>
+      <w:tr>
+        <w:tc>
+          <w:tcPr>
+            <w:tcW w:type="dxa" w:w="2410"/>
+            <w:tcBorders>
+              <w:top w:val="single" w:color="BFBFBF" w:sz="4"/>
+              <w:left w:val="single" w:color="BFBFBF" w:sz="4"/>
+              <w:bottom w:val="single" w:color="BFBFBF" w:sz="4"/>
+              <w:right w:val="single" w:color="BFBFBF" w:sz="4"/>
+            </w:tcBorders>
+            <w:tcMar>
+              <w:top w:type="dxa" w:w="60"/>
+              <w:left w:type="dxa" w:w="100"/>
+              <w:bottom w:type="dxa" w:w="60"/>
+              <w:right w:type="dxa" w:w="100"/>
+            </w:tcMar>
+          </w:tcPr>
+          <w:p>
+            <w:pPr>
+              <w:spacing w:after="20"/>
+            </w:pPr>
+            <w:r>
+              <w:rPr>
+                <w:rFonts w:ascii="Arial" w:cs="Arial" w:eastAsia="Arial" w:hAnsi="Arial"/>
+                <w:sz w:val="20"/>
+                <w:szCs w:val="20"/>
+              </w:rPr>
+              <w:t xml:space="preserve">Cấu hình bật tính năng</w:t>
+            </w:r>
+          </w:p>
+        </w:tc>
+        <w:tc>
+          <w:tcPr>
+            <w:tcW w:type="dxa" w:w="7228"/>
+            <w:tcBorders>
+              <w:top w:val="single" w:color="BFBFBF" w:sz="4"/>
+              <w:left w:val="single" w:color="BFBFBF" w:sz="4"/>
+              <w:bottom w:val="single" w:color="BFBFBF" w:sz="4"/>
+              <w:right w:val="single" w:color="BFBFBF" w:sz="4"/>
+            </w:tcBorders>
+            <w:tcMar>
+              <w:top w:type="dxa" w:w="60"/>
+              <w:left w:type="dxa" w:w="100"/>
+              <w:bottom w:type="dxa" w:w="60"/>
+              <w:right w:type="dxa" w:w="100"/>
+            </w:tcMar>
+          </w:tcPr>
+          <w:p>
+            <w:pPr>
+              <w:spacing w:after="20"/>
+            </w:pPr>
+            <w:r>
+              <w:rPr>
+                <w:rFonts w:ascii="Arial" w:cs="Arial" w:eastAsia="Arial" w:hAnsi="Arial"/>
+                <w:sz w:val="20"/>
+                <w:szCs w:val="20"/>
+              </w:rPr>
+              <w:t xml:space="preserve">Chạy SQL_ConnectionTest_DuyetKetQuaTheoDichVu_Config.sql (thêm key HIS.Desktop.Plugins.ConnectionTest.IsApproveResultByService vào HIS_CONFIG, mặc định trống = tắt). Viện dùng tính năng: đặt giá trị 1, người dùng đăng nhập lại HIS.</w:t>
             </w:r>
           </w:p>
         </w:tc>
@@ -6107,7 +6211,7 @@
                 <w:sz w:val="20"/>
                 <w:szCs w:val="20"/>
               </w:rPr>
-              <w:t xml:space="preserve">Mở màn hình Kết nối xét nghiệm</w:t>
+              <w:t xml:space="preserve">Cấu hình HIS.Desktop.Plugins.ConnectionTest.IsApproveResultByService = 1, mở màn hình Kết nối xét nghiệm</w:t>
             </w:r>
           </w:p>
         </w:tc>
@@ -6138,6 +6242,120 @@
                 <w:szCs w:val="20"/>
               </w:rPr>
               <w:t xml:space="preserve">Có nút Duyệt KQ ở hàng nút dưới; 2 cột người duyệt ẩn, bật được qua Column Chooser</w:t>
+            </w:r>
+          </w:p>
+        </w:tc>
+        <w:tc>
+          <w:tcPr>
+            <w:tcW w:type="dxa" w:w="964"/>
+            <w:tcBorders>
+              <w:top w:val="single" w:color="BFBFBF" w:sz="4"/>
+              <w:left w:val="single" w:color="BFBFBF" w:sz="4"/>
+              <w:bottom w:val="single" w:color="BFBFBF" w:sz="4"/>
+              <w:right w:val="single" w:color="BFBFBF" w:sz="4"/>
+            </w:tcBorders>
+            <w:tcMar>
+              <w:top w:type="dxa" w:w="60"/>
+              <w:left w:type="dxa" w:w="100"/>
+              <w:bottom w:type="dxa" w:w="60"/>
+              <w:right w:type="dxa" w:w="100"/>
+            </w:tcMar>
+          </w:tcPr>
+          <w:p>
+            <w:pPr>
+              <w:spacing w:after="20"/>
+            </w:pPr>
+          </w:p>
+        </w:tc>
+      </w:tr>
+      <w:tr>
+        <w:tc>
+          <w:tcPr>
+            <w:tcW w:type="dxa" w:w="578"/>
+            <w:tcBorders>
+              <w:top w:val="single" w:color="BFBFBF" w:sz="4"/>
+              <w:left w:val="single" w:color="BFBFBF" w:sz="4"/>
+              <w:bottom w:val="single" w:color="BFBFBF" w:sz="4"/>
+              <w:right w:val="single" w:color="BFBFBF" w:sz="4"/>
+            </w:tcBorders>
+            <w:tcMar>
+              <w:top w:type="dxa" w:w="60"/>
+              <w:left w:type="dxa" w:w="100"/>
+              <w:bottom w:type="dxa" w:w="60"/>
+              <w:right w:type="dxa" w:w="100"/>
+            </w:tcMar>
+          </w:tcPr>
+          <w:p>
+            <w:pPr>
+              <w:spacing w:after="20"/>
+            </w:pPr>
+            <w:r>
+              <w:rPr>
+                <w:rFonts w:ascii="Arial" w:cs="Arial" w:eastAsia="Arial" w:hAnsi="Arial"/>
+                <w:sz w:val="20"/>
+                <w:szCs w:val="20"/>
+              </w:rPr>
+              <w:t xml:space="preserve">1a</w:t>
+            </w:r>
+          </w:p>
+        </w:tc>
+        <w:tc>
+          <w:tcPr>
+            <w:tcW w:type="dxa" w:w="3277"/>
+            <w:tcBorders>
+              <w:top w:val="single" w:color="BFBFBF" w:sz="4"/>
+              <w:left w:val="single" w:color="BFBFBF" w:sz="4"/>
+              <w:bottom w:val="single" w:color="BFBFBF" w:sz="4"/>
+              <w:right w:val="single" w:color="BFBFBF" w:sz="4"/>
+            </w:tcBorders>
+            <w:tcMar>
+              <w:top w:type="dxa" w:w="60"/>
+              <w:left w:type="dxa" w:w="100"/>
+              <w:bottom w:type="dxa" w:w="60"/>
+              <w:right w:type="dxa" w:w="100"/>
+            </w:tcMar>
+          </w:tcPr>
+          <w:p>
+            <w:pPr>
+              <w:spacing w:after="20"/>
+            </w:pPr>
+            <w:r>
+              <w:rPr>
+                <w:rFonts w:ascii="Arial" w:cs="Arial" w:eastAsia="Arial" w:hAnsi="Arial"/>
+                <w:sz w:val="20"/>
+                <w:szCs w:val="20"/>
+              </w:rPr>
+              <w:t xml:space="preserve">Cấu hình trống / khác 1, mở màn hình Kết nối xét nghiệm</w:t>
+            </w:r>
+          </w:p>
+        </w:tc>
+        <w:tc>
+          <w:tcPr>
+            <w:tcW w:type="dxa" w:w="4819"/>
+            <w:tcBorders>
+              <w:top w:val="single" w:color="BFBFBF" w:sz="4"/>
+              <w:left w:val="single" w:color="BFBFBF" w:sz="4"/>
+              <w:bottom w:val="single" w:color="BFBFBF" w:sz="4"/>
+              <w:right w:val="single" w:color="BFBFBF" w:sz="4"/>
+            </w:tcBorders>
+            <w:tcMar>
+              <w:top w:type="dxa" w:w="60"/>
+              <w:left w:type="dxa" w:w="100"/>
+              <w:bottom w:type="dxa" w:w="60"/>
+              <w:right w:type="dxa" w:w="100"/>
+            </w:tcMar>
+          </w:tcPr>
+          <w:p>
+            <w:pPr>
+              <w:spacing w:after="20"/>
+            </w:pPr>
+            <w:r>
+              <w:rPr>
+                <w:rFonts w:ascii="Arial" w:cs="Arial" w:eastAsia="Arial" w:hAnsi="Arial"/>
+                <w:sz w:val="20"/>
+                <w:szCs w:val="20"/>
+              </w:rPr>
+              <w:t xml:space="preserve">Không có nút Duyệt KQ ở khu kết quả; Column Chooser không có 2 cột người duyệt; màn hình hoạt động như trước</w:t>
             </w:r>
           </w:p>
         </w:tc>

</xml_diff>

<commit_message>
ConnectionTest docs: bổ sung kiểm tra khi không thấy nút / nút mờ, log chẩn đoán, lưu ý triển khai (CONFIG_CODE tạm, gói backend LIS, kiểm tra API 405/404, backend chưa commit SVN)
Co-Authored-By: Claude Opus 5.5 <noreply@anthropic.com>
</commit_message>
<xml_diff>
--- a/docs/A_NghiepVu_ConnectionTest_DuyetKetQua.docx
+++ b/docs/A_NghiepVu_ConnectionTest_DuyetKetQua.docx
@@ -2125,6 +2125,166 @@
     </w:p>
     <w:p>
       <w:pPr>
+        <w:pStyle w:val="Heading3"/>
+        <w:spacing w:before="180" w:after="100"/>
+      </w:pPr>
+      <w:r>
+        <w:rPr>
+          <w:rFonts w:ascii="Arial" w:cs="Arial" w:eastAsia="Arial" w:hAnsi="Arial"/>
+        </w:rPr>
+        <w:t xml:space="preserve">Không thấy nút / nút bị mờ — cách kiểm tra</w:t>
+      </w:r>
+    </w:p>
+    <w:p>
+      <w:pPr>
+        <w:pStyle w:val="ListParagraph"/>
+        <w:numPr>
+          <w:ilvl w:val="0"/>
+          <w:numId w:val="2"/>
+        </w:numPr>
+        <w:spacing w:after="60"/>
+      </w:pPr>
+      <w:r>
+        <w:rPr>
+          <w:b/>
+          <w:bCs/>
+          <w:rFonts w:ascii="Arial" w:cs="Arial" w:eastAsia="Arial" w:hAnsi="Arial"/>
+        </w:rPr>
+        <w:t xml:space="preserve">Không thấy nút:</w:t>
+      </w:r>
+      <w:r>
+        <w:rPr>
+          <w:rFonts w:ascii="Arial" w:cs="Arial" w:eastAsia="Arial" w:hAnsi="Arial"/>
+        </w:rPr>
+        <w:t xml:space="preserve"> cấu hình HIS.Desktop.Plugins.ConnectionTest.IsApproveResultByService chưa đặt 1, hoặc đã đặt nhưng người dùng chưa đăng xuất / đăng nhập lại HIS; hoặc máy trạm còn chạy bản phần mềm cũ.</w:t>
+      </w:r>
+    </w:p>
+    <w:p>
+      <w:pPr>
+        <w:pStyle w:val="ListParagraph"/>
+        <w:numPr>
+          <w:ilvl w:val="0"/>
+          <w:numId w:val="2"/>
+        </w:numPr>
+        <w:spacing w:after="60"/>
+      </w:pPr>
+      <w:r>
+        <w:rPr>
+          <w:b/>
+          <w:bCs/>
+          <w:rFonts w:ascii="Arial" w:cs="Arial" w:eastAsia="Arial" w:hAnsi="Arial"/>
+        </w:rPr>
+        <w:t xml:space="preserve">Nút mờ, gợi ý "Mẫu chưa được chấp nhận, chưa thể duyệt kết quả":</w:t>
+      </w:r>
+      <w:r>
+        <w:rPr>
+          <w:rFonts w:ascii="Arial" w:cs="Arial" w:eastAsia="Arial" w:hAnsi="Arial"/>
+        </w:rPr>
+        <w:t xml:space="preserve"> chấp nhận mẫu (cột "Duyệt mẫu" trên danh sách mẫu) rồi chọn lại mẫu.</w:t>
+      </w:r>
+    </w:p>
+    <w:p>
+      <w:pPr>
+        <w:pStyle w:val="ListParagraph"/>
+        <w:numPr>
+          <w:ilvl w:val="0"/>
+          <w:numId w:val="2"/>
+        </w:numPr>
+        <w:spacing w:after="60"/>
+      </w:pPr>
+      <w:r>
+        <w:rPr>
+          <w:b/>
+          <w:bCs/>
+          <w:rFonts w:ascii="Arial" w:cs="Arial" w:eastAsia="Arial" w:hAnsi="Arial"/>
+        </w:rPr>
+        <w:t xml:space="preserve">Nút mờ, gợi ý "Dịch vụ được tích chưa có đủ kết quả":</w:t>
+      </w:r>
+      <w:r>
+        <w:rPr>
+          <w:rFonts w:ascii="Arial" w:cs="Arial" w:eastAsia="Arial" w:hAnsi="Arial"/>
+        </w:rPr>
+        <w:t xml:space="preserve"> dịch vụ chỉ được tính là có kết quả khi </w:t>
+      </w:r>
+      <w:r>
+        <w:rPr>
+          <w:b/>
+          <w:bCs/>
+          <w:rFonts w:ascii="Arial" w:cs="Arial" w:eastAsia="Arial" w:hAnsi="Arial"/>
+        </w:rPr>
+        <w:t xml:space="preserve">mọi chỉ số của dịch vụ</w:t>
+      </w:r>
+      <w:r>
+        <w:rPr>
+          <w:rFonts w:ascii="Arial" w:cs="Arial" w:eastAsia="Arial" w:hAnsi="Arial"/>
+        </w:rPr>
+        <w:t xml:space="preserve"> đã có giá trị </w:t>
+      </w:r>
+      <w:r>
+        <w:rPr>
+          <w:b/>
+          <w:bCs/>
+          <w:rFonts w:ascii="Arial" w:cs="Arial" w:eastAsia="Arial" w:hAnsi="Arial"/>
+        </w:rPr>
+        <w:t xml:space="preserve">và đã Lưu</w:t>
+      </w:r>
+      <w:r>
+        <w:rPr>
+          <w:rFonts w:ascii="Arial" w:cs="Arial" w:eastAsia="Arial" w:hAnsi="Arial"/>
+        </w:rPr>
+        <w:t xml:space="preserve">. Còn 1 chỉ số trống (kể cả chỉ số ít dùng) hoặc nhập mà chưa Lưu thì dịch vụ vẫn ở trạng thái "Chưa có KQ".</w:t>
+      </w:r>
+    </w:p>
+    <w:p>
+      <w:pPr>
+        <w:pStyle w:val="ListParagraph"/>
+        <w:numPr>
+          <w:ilvl w:val="0"/>
+          <w:numId w:val="2"/>
+        </w:numPr>
+        <w:spacing w:after="60"/>
+      </w:pPr>
+      <w:r>
+        <w:rPr>
+          <w:b/>
+          <w:bCs/>
+          <w:rFonts w:ascii="Arial" w:cs="Arial" w:eastAsia="Arial" w:hAnsi="Arial"/>
+        </w:rPr>
+        <w:t xml:space="preserve">Nút "Hủy duyệt KQ" mờ, gợi ý "Mẫu đã trả kết quả…":</w:t>
+      </w:r>
+      <w:r>
+        <w:rPr>
+          <w:rFonts w:ascii="Arial" w:cs="Arial" w:eastAsia="Arial" w:hAnsi="Arial"/>
+        </w:rPr>
+        <w:t xml:space="preserve"> Hủy trả kết quả mẫu trước rồi mới hủy duyệt.</w:t>
+      </w:r>
+    </w:p>
+    <w:p>
+      <w:pPr>
+        <w:pStyle w:val="ListParagraph"/>
+        <w:numPr>
+          <w:ilvl w:val="0"/>
+          <w:numId w:val="2"/>
+        </w:numPr>
+        <w:spacing w:after="60"/>
+      </w:pPr>
+      <w:r>
+        <w:rPr>
+          <w:b/>
+          <w:bCs/>
+          <w:rFonts w:ascii="Arial" w:cs="Arial" w:eastAsia="Arial" w:hAnsi="Arial"/>
+        </w:rPr>
+        <w:t xml:space="preserve">Vẫn chưa rõ nguyên nhân:</w:t>
+      </w:r>
+      <w:r>
+        <w:rPr>
+          <w:rFonts w:ascii="Arial" w:cs="Arial" w:eastAsia="Arial" w:hAnsi="Arial"/>
+        </w:rPr>
+        <w:t xml:space="preserve"> gửi file Logs\LogSystem.txt của máy trạm cho bộ phận kỹ thuật kèm mã mẫu (barcode) và thời điểm thao tác — phần mềm ghi trạng thái mẫu và từng dịch vụ được tích mỗi lần tính trạng thái nút.</w:t>
+      </w:r>
+    </w:p>
+    <w:p>
+      <w:pPr>
         <w:pStyle w:val="Heading2"/>
         <w:spacing w:before="240" w:after="120"/>
       </w:pPr>
@@ -5145,7 +5305,7 @@
                 <w:sz w:val="20"/>
                 <w:szCs w:val="20"/>
               </w:rPr>
-              <w:t xml:space="preserve">Chạy SQL_ConnectionTest_DuyetKetQuaTheoDichVu_Config.sql (thêm key HIS.Desktop.Plugins.ConnectionTest.IsApproveResultByService vào HIS_CONFIG, mặc định trống = tắt). Viện dùng tính năng: đặt giá trị 1, người dùng đăng nhập lại HIS.</w:t>
+              <w:t xml:space="preserve">Chạy SQL_ConnectionTest_DuyetKetQuaTheoDichVu_Config.sql (thêm key HIS.Desktop.Plugins.ConnectionTest.IsApproveResultByService vào HIS_CONFIG, mặc định trống = tắt). Lưu ý: CONFIG_CODE trong script là mã tạm — thay bằng mã kế tiếp chưa dùng trong HIS_CONFIG trước khi chạy. Viện dùng tính năng: đặt giá trị 1, người dùng đăng xuất và đăng nhập lại HIS (cấu hình chỉ nạp khi đăng nhập).</w:t>
             </w:r>
           </w:p>
         </w:tc>

</xml_diff>